<commit_message>
Update CV with address/website
</commit_message>
<xml_diff>
--- a/files/cv.docx
+++ b/files/cv.docx
@@ -1,6 +1,6 @@
 
 <file path=word/document.xml><?xml version="1.0" encoding="utf-8"?>
-<w:document xmlns:wpc="http://schemas.microsoft.com/office/word/2010/wordprocessingCanvas" xmlns:mc="http://schemas.openxmlformats.org/markup-compatibility/2006" xmlns:o="urn:schemas-microsoft-com:office:office" xmlns:r="http://schemas.openxmlformats.org/officeDocument/2006/relationships" xmlns:m="http://schemas.openxmlformats.org/officeDocument/2006/math" xmlns:v="urn:schemas-microsoft-com:vml" xmlns:wp14="http://schemas.microsoft.com/office/word/2010/wordprocessingDrawing" xmlns:wp="http://schemas.openxmlformats.org/drawingml/2006/wordprocessingDrawing" xmlns:w10="urn:schemas-microsoft-com:office:word" xmlns:w="http://schemas.openxmlformats.org/wordprocessingml/2006/main" xmlns:w14="http://schemas.microsoft.com/office/word/2010/wordml" xmlns:w15="http://schemas.microsoft.com/office/word/2012/wordml" xmlns:wpg="http://schemas.microsoft.com/office/word/2010/wordprocessingGroup" xmlns:wpi="http://schemas.microsoft.com/office/word/2010/wordprocessingInk" xmlns:wne="http://schemas.microsoft.com/office/word/2006/wordml" xmlns:wps="http://schemas.microsoft.com/office/word/2010/wordprocessingShape" mc:Ignorable="w14 w15 wp14">
+<w:document xmlns:wpc="http://schemas.microsoft.com/office/word/2010/wordprocessingCanvas" xmlns:cx="http://schemas.microsoft.com/office/drawing/2014/chartex" xmlns:cx1="http://schemas.microsoft.com/office/drawing/2015/9/8/chartex" xmlns:mc="http://schemas.openxmlformats.org/markup-compatibility/2006" xmlns:o="urn:schemas-microsoft-com:office:office" xmlns:r="http://schemas.openxmlformats.org/officeDocument/2006/relationships" xmlns:m="http://schemas.openxmlformats.org/officeDocument/2006/math" xmlns:v="urn:schemas-microsoft-com:vml" xmlns:wp14="http://schemas.microsoft.com/office/word/2010/wordprocessingDrawing" xmlns:wp="http://schemas.openxmlformats.org/drawingml/2006/wordprocessingDrawing" xmlns:w10="urn:schemas-microsoft-com:office:word" xmlns:w="http://schemas.openxmlformats.org/wordprocessingml/2006/main" xmlns:w14="http://schemas.microsoft.com/office/word/2010/wordml" xmlns:w15="http://schemas.microsoft.com/office/word/2012/wordml" xmlns:w16se="http://schemas.microsoft.com/office/word/2015/wordml/symex" xmlns:wpg="http://schemas.microsoft.com/office/word/2010/wordprocessingGroup" xmlns:wpi="http://schemas.microsoft.com/office/word/2010/wordprocessingInk" xmlns:wne="http://schemas.microsoft.com/office/word/2006/wordml" xmlns:wps="http://schemas.microsoft.com/office/word/2010/wordprocessingShape" mc:Ignorable="w14 w15 w16se wp14">
   <w:body>
     <w:p>
       <w:pPr>
@@ -41,7 +41,7 @@
     <w:tbl>
       <w:tblPr>
         <w:tblStyle w:val="TableGrid"/>
-        <w:tblW w:w="0" w:type="auto"/>
+        <w:tblW w:w="7089" w:type="dxa"/>
         <w:jc w:val="center"/>
         <w:tblBorders>
           <w:top w:val="none" w:sz="0" w:space="0" w:color="auto"/>
@@ -54,15 +54,17 @@
         <w:tblLook w:val="04A0" w:firstRow="1" w:lastRow="0" w:firstColumn="1" w:lastColumn="0" w:noHBand="0" w:noVBand="1"/>
       </w:tblPr>
       <w:tblGrid>
-        <w:gridCol w:w="3387"/>
+        <w:gridCol w:w="3762"/>
+        <w:gridCol w:w="3327"/>
       </w:tblGrid>
       <w:tr>
         <w:trPr>
+          <w:trHeight w:val="1006"/>
           <w:jc w:val="center"/>
         </w:trPr>
         <w:tc>
           <w:tcPr>
-            <w:tcW w:w="3312" w:type="dxa"/>
+            <w:tcW w:w="3762" w:type="dxa"/>
           </w:tcPr>
           <w:p>
             <w:pPr>
@@ -95,6 +97,8 @@
               </w:rPr>
               <w:t>919.605.6175</w:t>
             </w:r>
+            <w:bookmarkStart w:id="0" w:name="_GoBack"/>
+            <w:bookmarkEnd w:id="0"/>
           </w:p>
           <w:p>
             <w:pPr>
@@ -109,7 +113,7 @@
                 <w:rFonts w:ascii="Times New Roman" w:hAnsi="Times New Roman" w:cs="Times New Roman"/>
                 <w:sz w:val="20"/>
               </w:rPr>
-              <w:t>linkedin.com/in/alexandriavail</w:t>
+              <w:t>alexandriakvail.com</w:t>
             </w:r>
             <w:r>
               <w:rPr>
@@ -117,7 +121,15 @@
                 <w:sz w:val="20"/>
               </w:rPr>
               <w:br/>
-              <w:t>researchgate.net/profile/alexandria_v</w:t>
+              <w:t>researchgate.net/profile/</w:t>
+            </w:r>
+            <w:proofErr w:type="spellStart"/>
+            <w:r>
+              <w:rPr>
+                <w:rFonts w:ascii="Times New Roman" w:hAnsi="Times New Roman" w:cs="Times New Roman"/>
+                <w:sz w:val="20"/>
+              </w:rPr>
+              <w:t>alexandria_v</w:t>
             </w:r>
             <w:r>
               <w:rPr>
@@ -125,6 +137,76 @@
                 <w:sz w:val="20"/>
               </w:rPr>
               <w:t>ail</w:t>
+            </w:r>
+            <w:proofErr w:type="spellEnd"/>
+          </w:p>
+        </w:tc>
+        <w:tc>
+          <w:tcPr>
+            <w:tcW w:w="3327" w:type="dxa"/>
+          </w:tcPr>
+          <w:p>
+            <w:pPr>
+              <w:jc w:val="center"/>
+              <w:rPr>
+                <w:rFonts w:ascii="Times New Roman" w:hAnsi="Times New Roman" w:cs="Times New Roman"/>
+                <w:sz w:val="20"/>
+              </w:rPr>
+            </w:pPr>
+            <w:r>
+              <w:rPr>
+                <w:rFonts w:ascii="Times New Roman" w:hAnsi="Times New Roman" w:cs="Times New Roman"/>
+                <w:sz w:val="20"/>
+              </w:rPr>
+              <w:t>5000 Forbes Avenue</w:t>
+            </w:r>
+          </w:p>
+          <w:p>
+            <w:pPr>
+              <w:jc w:val="center"/>
+              <w:rPr>
+                <w:rFonts w:ascii="Times New Roman" w:hAnsi="Times New Roman" w:cs="Times New Roman"/>
+                <w:sz w:val="20"/>
+              </w:rPr>
+            </w:pPr>
+            <w:r>
+              <w:rPr>
+                <w:rFonts w:ascii="Times New Roman" w:hAnsi="Times New Roman" w:cs="Times New Roman"/>
+                <w:sz w:val="20"/>
+              </w:rPr>
+              <w:t>Human-Computer Interaction Institute</w:t>
+            </w:r>
+          </w:p>
+          <w:p>
+            <w:pPr>
+              <w:jc w:val="center"/>
+              <w:rPr>
+                <w:rFonts w:ascii="Times New Roman" w:hAnsi="Times New Roman" w:cs="Times New Roman"/>
+                <w:sz w:val="20"/>
+              </w:rPr>
+            </w:pPr>
+            <w:r>
+              <w:rPr>
+                <w:rFonts w:ascii="Times New Roman" w:hAnsi="Times New Roman" w:cs="Times New Roman"/>
+                <w:sz w:val="20"/>
+              </w:rPr>
+              <w:t>Newell-Simon Hall</w:t>
+            </w:r>
+          </w:p>
+          <w:p>
+            <w:pPr>
+              <w:jc w:val="center"/>
+              <w:rPr>
+                <w:rFonts w:ascii="Times New Roman" w:hAnsi="Times New Roman" w:cs="Times New Roman"/>
+                <w:sz w:val="20"/>
+              </w:rPr>
+            </w:pPr>
+            <w:r>
+              <w:rPr>
+                <w:rFonts w:ascii="Times New Roman" w:hAnsi="Times New Roman" w:cs="Times New Roman"/>
+                <w:sz w:val="20"/>
+              </w:rPr>
+              <w:t>Pittsburgh, PA 15213-3815</w:t>
             </w:r>
           </w:p>
         </w:tc>
@@ -492,20 +574,7 @@
           <w:rFonts w:ascii="Times New Roman" w:hAnsi="Times New Roman" w:cs="Times New Roman"/>
         </w:rPr>
         <w:br/>
-      </w:r>
-      <w:proofErr w:type="gramStart"/>
-      <w:r>
-        <w:rPr>
-          <w:rFonts w:ascii="Times New Roman" w:hAnsi="Times New Roman" w:cs="Times New Roman"/>
-        </w:rPr>
-        <w:t>The</w:t>
-      </w:r>
-      <w:proofErr w:type="gramEnd"/>
-      <w:r>
-        <w:rPr>
-          <w:rFonts w:ascii="Times New Roman" w:hAnsi="Times New Roman" w:cs="Times New Roman"/>
-        </w:rPr>
-        <w:t xml:space="preserve"> LearnDialogue Group, The Intellimedia Group</w:t>
+        <w:t>The LearnDialogue Group, The Intellimedia Group</w:t>
       </w:r>
     </w:p>
     <w:p>
@@ -559,19 +628,11 @@
         </w:rPr>
         <w:br/>
       </w:r>
-      <w:proofErr w:type="gramStart"/>
-      <w:r>
-        <w:rPr>
-          <w:rFonts w:ascii="Times New Roman" w:hAnsi="Times New Roman" w:cs="Times New Roman"/>
-        </w:rPr>
-        <w:t>The</w:t>
-      </w:r>
-      <w:proofErr w:type="gramEnd"/>
-      <w:r>
-        <w:rPr>
-          <w:rFonts w:ascii="Times New Roman" w:hAnsi="Times New Roman" w:cs="Times New Roman"/>
-        </w:rPr>
-        <w:t xml:space="preserve"> LearnDialogue Group</w:t>
+      <w:r>
+        <w:rPr>
+          <w:rFonts w:ascii="Times New Roman" w:hAnsi="Times New Roman" w:cs="Times New Roman"/>
+        </w:rPr>
+        <w:t>The LearnDialogue Group</w:t>
       </w:r>
     </w:p>
     <w:p>
@@ -1083,21 +1144,7 @@
         <w:rPr>
           <w:rFonts w:ascii="Times New Roman" w:hAnsi="Times New Roman" w:cs="Times New Roman"/>
         </w:rPr>
-        <w:t xml:space="preserve">, J. Grafsgaard, K. Boyer, E. Wiebe, and J. Lester. Gender Differences in Facial Expressions of Affect </w:t>
-      </w:r>
-      <w:proofErr w:type="gramStart"/>
-      <w:r>
-        <w:rPr>
-          <w:rFonts w:ascii="Times New Roman" w:hAnsi="Times New Roman" w:cs="Times New Roman"/>
-        </w:rPr>
-        <w:t>During</w:t>
-      </w:r>
-      <w:proofErr w:type="gramEnd"/>
-      <w:r>
-        <w:rPr>
-          <w:rFonts w:ascii="Times New Roman" w:hAnsi="Times New Roman" w:cs="Times New Roman"/>
-        </w:rPr>
-        <w:t xml:space="preserve"> Learning. </w:t>
+        <w:t xml:space="preserve">, J. Grafsgaard, K. Boyer, E. Wiebe, and J. Lester. Gender Differences in Facial Expressions of Affect During Learning. </w:t>
       </w:r>
       <w:r>
         <w:rPr>
@@ -1129,21 +1176,7 @@
         <w:rPr>
           <w:rFonts w:ascii="Times New Roman" w:hAnsi="Times New Roman" w:cs="Times New Roman"/>
         </w:rPr>
-        <w:t>, Halifax, Canada, 2016. (</w:t>
-      </w:r>
-      <w:proofErr w:type="gramStart"/>
-      <w:r>
-        <w:rPr>
-          <w:rFonts w:ascii="Times New Roman" w:hAnsi="Times New Roman" w:cs="Times New Roman"/>
-        </w:rPr>
-        <w:t>long</w:t>
-      </w:r>
-      <w:proofErr w:type="gramEnd"/>
-      <w:r>
-        <w:rPr>
-          <w:rFonts w:ascii="Times New Roman" w:hAnsi="Times New Roman" w:cs="Times New Roman"/>
-        </w:rPr>
-        <w:t xml:space="preserve"> paper, acceptance rate: 23.9%) </w:t>
+        <w:t xml:space="preserve">, Halifax, Canada, 2016. (long paper, acceptance rate: 23.9%) </w:t>
       </w:r>
     </w:p>
     <w:p>
@@ -1190,15 +1223,7 @@
         <w:rPr>
           <w:rFonts w:ascii="Times New Roman" w:hAnsi="Times New Roman" w:cs="Times New Roman"/>
         </w:rPr>
-        <w:t>, J. Wiggins, J. Grafsgaa</w:t>
-      </w:r>
-      <w:bookmarkStart w:id="0" w:name="_GoBack"/>
-      <w:bookmarkEnd w:id="0"/>
-      <w:r>
-        <w:rPr>
-          <w:rFonts w:ascii="Times New Roman" w:hAnsi="Times New Roman" w:cs="Times New Roman"/>
-        </w:rPr>
-        <w:t xml:space="preserve">rd, K. Boyer, E. Wiebe, and J. Lester. The Affective Impact of Tutor Questions: Predicting Frustration and Engagement. </w:t>
+        <w:t xml:space="preserve">, J. Wiggins, J. Grafsgaard, K. Boyer, E. Wiebe, and J. Lester. The Affective Impact of Tutor Questions: Predicting Frustration and Engagement. </w:t>
       </w:r>
       <w:r>
         <w:rPr>
@@ -1249,21 +1274,7 @@
         <w:rPr>
           <w:rFonts w:ascii="Times New Roman" w:hAnsi="Times New Roman" w:cs="Times New Roman"/>
         </w:rPr>
-        <w:t xml:space="preserve"> (</w:t>
-      </w:r>
-      <w:proofErr w:type="gramStart"/>
-      <w:r>
-        <w:rPr>
-          <w:rFonts w:ascii="Times New Roman" w:hAnsi="Times New Roman" w:cs="Times New Roman"/>
-        </w:rPr>
-        <w:t>long</w:t>
-      </w:r>
-      <w:proofErr w:type="gramEnd"/>
-      <w:r>
-        <w:rPr>
-          <w:rFonts w:ascii="Times New Roman" w:hAnsi="Times New Roman" w:cs="Times New Roman"/>
-        </w:rPr>
-        <w:t xml:space="preserve"> paper, acceptance rate: 27.5%)</w:t>
+        <w:t xml:space="preserve"> (long paper, acceptance rate: 27.5%)</w:t>
       </w:r>
       <w:r>
         <w:rPr>
@@ -1398,21 +1409,7 @@
         <w:rPr>
           <w:rFonts w:ascii="Times New Roman" w:hAnsi="Times New Roman" w:cs="Times New Roman"/>
         </w:rPr>
-        <w:t xml:space="preserve"> (</w:t>
-      </w:r>
-      <w:proofErr w:type="gramStart"/>
-      <w:r>
-        <w:rPr>
-          <w:rFonts w:ascii="Times New Roman" w:hAnsi="Times New Roman" w:cs="Times New Roman"/>
-        </w:rPr>
-        <w:t>short</w:t>
-      </w:r>
-      <w:proofErr w:type="gramEnd"/>
-      <w:r>
-        <w:rPr>
-          <w:rFonts w:ascii="Times New Roman" w:hAnsi="Times New Roman" w:cs="Times New Roman"/>
-        </w:rPr>
-        <w:t xml:space="preserve"> paper, acceptance rate: 52%)</w:t>
+        <w:t xml:space="preserve"> (short paper, acceptance rate: 52%)</w:t>
       </w:r>
     </w:p>
     <w:p>
@@ -1477,21 +1474,7 @@
         <w:rPr>
           <w:rFonts w:ascii="Times New Roman" w:hAnsi="Times New Roman" w:cs="Times New Roman"/>
         </w:rPr>
-        <w:t>, Zagreb, Croatia, 2016. (</w:t>
-      </w:r>
-      <w:proofErr w:type="gramStart"/>
-      <w:r>
-        <w:rPr>
-          <w:rFonts w:ascii="Times New Roman" w:hAnsi="Times New Roman" w:cs="Times New Roman"/>
-        </w:rPr>
-        <w:t>long</w:t>
-      </w:r>
-      <w:proofErr w:type="gramEnd"/>
-      <w:r>
-        <w:rPr>
-          <w:rFonts w:ascii="Times New Roman" w:hAnsi="Times New Roman" w:cs="Times New Roman"/>
-        </w:rPr>
-        <w:t xml:space="preserve"> paper</w:t>
+        <w:t>, Zagreb, Croatia, 2016. (long paper</w:t>
       </w:r>
       <w:r>
         <w:rPr>
@@ -1576,19 +1559,11 @@
         </w:rPr>
         <w:t>227, Dublin, Ireland, 2015. (</w:t>
       </w:r>
-      <w:proofErr w:type="gramStart"/>
-      <w:r>
-        <w:rPr>
-          <w:rFonts w:ascii="Times New Roman" w:hAnsi="Times New Roman" w:cs="Times New Roman"/>
-        </w:rPr>
-        <w:t>long</w:t>
-      </w:r>
-      <w:proofErr w:type="gramEnd"/>
-      <w:r>
-        <w:rPr>
-          <w:rFonts w:ascii="Times New Roman" w:hAnsi="Times New Roman" w:cs="Times New Roman"/>
-        </w:rPr>
-        <w:t xml:space="preserve"> paper, </w:t>
+      <w:r>
+        <w:rPr>
+          <w:rFonts w:ascii="Times New Roman" w:hAnsi="Times New Roman" w:cs="Times New Roman"/>
+        </w:rPr>
+        <w:t xml:space="preserve">long paper, </w:t>
       </w:r>
       <w:r>
         <w:rPr>
@@ -1702,19 +1677,11 @@
         </w:rPr>
         <w:t xml:space="preserve"> (</w:t>
       </w:r>
-      <w:proofErr w:type="gramStart"/>
-      <w:r>
-        <w:rPr>
-          <w:rFonts w:ascii="Times New Roman" w:hAnsi="Times New Roman" w:cs="Times New Roman"/>
-        </w:rPr>
-        <w:t>long</w:t>
-      </w:r>
-      <w:proofErr w:type="gramEnd"/>
-      <w:r>
-        <w:rPr>
-          <w:rFonts w:ascii="Times New Roman" w:hAnsi="Times New Roman" w:cs="Times New Roman"/>
-        </w:rPr>
-        <w:t xml:space="preserve"> paper, </w:t>
+      <w:r>
+        <w:rPr>
+          <w:rFonts w:ascii="Times New Roman" w:hAnsi="Times New Roman" w:cs="Times New Roman"/>
+        </w:rPr>
+        <w:t xml:space="preserve">long paper, </w:t>
       </w:r>
       <w:r>
         <w:rPr>
@@ -1753,21 +1720,7 @@
         <w:rPr>
           <w:rFonts w:ascii="Times New Roman" w:hAnsi="Times New Roman" w:cs="Times New Roman"/>
         </w:rPr>
-        <w:t xml:space="preserve">, K. Boyer, E. Wiebe, and J. Lester. The Additive Value of Multimodal Features for Predicting Engagement, Frustration, and Learning </w:t>
-      </w:r>
-      <w:proofErr w:type="gramStart"/>
-      <w:r>
-        <w:rPr>
-          <w:rFonts w:ascii="Times New Roman" w:hAnsi="Times New Roman" w:cs="Times New Roman"/>
-        </w:rPr>
-        <w:t>During</w:t>
-      </w:r>
-      <w:proofErr w:type="gramEnd"/>
-      <w:r>
-        <w:rPr>
-          <w:rFonts w:ascii="Times New Roman" w:hAnsi="Times New Roman" w:cs="Times New Roman"/>
-        </w:rPr>
-        <w:t xml:space="preserve"> Tutoring. </w:t>
+        <w:t xml:space="preserve">, K. Boyer, E. Wiebe, and J. Lester. The Additive Value of Multimodal Features for Predicting Engagement, Frustration, and Learning During Tutoring. </w:t>
       </w:r>
       <w:r>
         <w:rPr>
@@ -1800,19 +1753,11 @@
         </w:rPr>
         <w:t xml:space="preserve"> (</w:t>
       </w:r>
-      <w:proofErr w:type="gramStart"/>
-      <w:r>
-        <w:rPr>
-          <w:rFonts w:ascii="Times New Roman" w:hAnsi="Times New Roman" w:cs="Times New Roman"/>
-        </w:rPr>
-        <w:t>long</w:t>
-      </w:r>
-      <w:proofErr w:type="gramEnd"/>
-      <w:r>
-        <w:rPr>
-          <w:rFonts w:ascii="Times New Roman" w:hAnsi="Times New Roman" w:cs="Times New Roman"/>
-        </w:rPr>
-        <w:t xml:space="preserve"> paper, </w:t>
+      <w:r>
+        <w:rPr>
+          <w:rFonts w:ascii="Times New Roman" w:hAnsi="Times New Roman" w:cs="Times New Roman"/>
+        </w:rPr>
+        <w:t xml:space="preserve">long paper, </w:t>
       </w:r>
       <w:r>
         <w:rPr>
@@ -1851,21 +1796,7 @@
         <w:rPr>
           <w:rFonts w:ascii="Times New Roman" w:hAnsi="Times New Roman" w:cs="Times New Roman"/>
         </w:rPr>
-        <w:t xml:space="preserve">K. Boyer. Adapting to Personality </w:t>
-      </w:r>
-      <w:proofErr w:type="gramStart"/>
-      <w:r>
-        <w:rPr>
-          <w:rFonts w:ascii="Times New Roman" w:hAnsi="Times New Roman" w:cs="Times New Roman"/>
-        </w:rPr>
-        <w:t>Over</w:t>
-      </w:r>
-      <w:proofErr w:type="gramEnd"/>
-      <w:r>
-        <w:rPr>
-          <w:rFonts w:ascii="Times New Roman" w:hAnsi="Times New Roman" w:cs="Times New Roman"/>
-        </w:rPr>
-        <w:t xml:space="preserve"> Time: Examining the Effectiveness of Dialogue Policy Progressions in Task-Oriented Interaction. </w:t>
+        <w:t xml:space="preserve">K. Boyer. Adapting to Personality Over Time: Examining the Effectiveness of Dialogue Policy Progressions in Task-Oriented Interaction. </w:t>
       </w:r>
       <w:r>
         <w:rPr>
@@ -1898,19 +1829,11 @@
         </w:rPr>
         <w:t xml:space="preserve"> (</w:t>
       </w:r>
-      <w:proofErr w:type="gramStart"/>
-      <w:r>
-        <w:rPr>
-          <w:rFonts w:ascii="Times New Roman" w:hAnsi="Times New Roman" w:cs="Times New Roman"/>
-        </w:rPr>
-        <w:t>long</w:t>
-      </w:r>
-      <w:proofErr w:type="gramEnd"/>
-      <w:r>
-        <w:rPr>
-          <w:rFonts w:ascii="Times New Roman" w:hAnsi="Times New Roman" w:cs="Times New Roman"/>
-        </w:rPr>
-        <w:t xml:space="preserve"> paper, </w:t>
+      <w:r>
+        <w:rPr>
+          <w:rFonts w:ascii="Times New Roman" w:hAnsi="Times New Roman" w:cs="Times New Roman"/>
+        </w:rPr>
+        <w:t xml:space="preserve">long paper, </w:t>
       </w:r>
       <w:r>
         <w:rPr>
@@ -1988,19 +1911,11 @@
         </w:rPr>
         <w:t xml:space="preserve"> (</w:t>
       </w:r>
-      <w:proofErr w:type="gramStart"/>
-      <w:r>
-        <w:rPr>
-          <w:rFonts w:ascii="Times New Roman" w:hAnsi="Times New Roman" w:cs="Times New Roman"/>
-        </w:rPr>
-        <w:t>long</w:t>
-      </w:r>
-      <w:proofErr w:type="gramEnd"/>
-      <w:r>
-        <w:rPr>
-          <w:rFonts w:ascii="Times New Roman" w:hAnsi="Times New Roman" w:cs="Times New Roman"/>
-        </w:rPr>
-        <w:t xml:space="preserve"> paper, </w:t>
+      <w:r>
+        <w:rPr>
+          <w:rFonts w:ascii="Times New Roman" w:hAnsi="Times New Roman" w:cs="Times New Roman"/>
+        </w:rPr>
+        <w:t xml:space="preserve">long paper, </w:t>
       </w:r>
       <w:r>
         <w:rPr>
@@ -3311,7 +3226,7 @@
 </file>
 
 <file path=word/endnotes.xml><?xml version="1.0" encoding="utf-8"?>
-<w:endnotes xmlns:wpc="http://schemas.microsoft.com/office/word/2010/wordprocessingCanvas" xmlns:mc="http://schemas.openxmlformats.org/markup-compatibility/2006" xmlns:o="urn:schemas-microsoft-com:office:office" xmlns:r="http://schemas.openxmlformats.org/officeDocument/2006/relationships" xmlns:m="http://schemas.openxmlformats.org/officeDocument/2006/math" xmlns:v="urn:schemas-microsoft-com:vml" xmlns:wp14="http://schemas.microsoft.com/office/word/2010/wordprocessingDrawing" xmlns:wp="http://schemas.openxmlformats.org/drawingml/2006/wordprocessingDrawing" xmlns:w10="urn:schemas-microsoft-com:office:word" xmlns:w="http://schemas.openxmlformats.org/wordprocessingml/2006/main" xmlns:w14="http://schemas.microsoft.com/office/word/2010/wordml" xmlns:w15="http://schemas.microsoft.com/office/word/2012/wordml" xmlns:wpg="http://schemas.microsoft.com/office/word/2010/wordprocessingGroup" xmlns:wpi="http://schemas.microsoft.com/office/word/2010/wordprocessingInk" xmlns:wne="http://schemas.microsoft.com/office/word/2006/wordml" xmlns:wps="http://schemas.microsoft.com/office/word/2010/wordprocessingShape" mc:Ignorable="w14 w15 wp14">
+<w:endnotes xmlns:wpc="http://schemas.microsoft.com/office/word/2010/wordprocessingCanvas" xmlns:cx="http://schemas.microsoft.com/office/drawing/2014/chartex" xmlns:cx1="http://schemas.microsoft.com/office/drawing/2015/9/8/chartex" xmlns:mc="http://schemas.openxmlformats.org/markup-compatibility/2006" xmlns:o="urn:schemas-microsoft-com:office:office" xmlns:r="http://schemas.openxmlformats.org/officeDocument/2006/relationships" xmlns:m="http://schemas.openxmlformats.org/officeDocument/2006/math" xmlns:v="urn:schemas-microsoft-com:vml" xmlns:wp14="http://schemas.microsoft.com/office/word/2010/wordprocessingDrawing" xmlns:wp="http://schemas.openxmlformats.org/drawingml/2006/wordprocessingDrawing" xmlns:w10="urn:schemas-microsoft-com:office:word" xmlns:w="http://schemas.openxmlformats.org/wordprocessingml/2006/main" xmlns:w14="http://schemas.microsoft.com/office/word/2010/wordml" xmlns:w15="http://schemas.microsoft.com/office/word/2012/wordml" xmlns:w16se="http://schemas.microsoft.com/office/word/2015/wordml/symex" xmlns:wpg="http://schemas.microsoft.com/office/word/2010/wordprocessingGroup" xmlns:wpi="http://schemas.microsoft.com/office/word/2010/wordprocessingInk" xmlns:wne="http://schemas.microsoft.com/office/word/2006/wordml" xmlns:wps="http://schemas.microsoft.com/office/word/2010/wordprocessingShape" mc:Ignorable="w14 w15 w16se wp14">
   <w:endnote w:type="separator" w:id="-1">
     <w:p>
       <w:pPr>
@@ -3336,7 +3251,7 @@
 </file>
 
 <file path=word/footer1.xml><?xml version="1.0" encoding="utf-8"?>
-<w:ftr xmlns:wpc="http://schemas.microsoft.com/office/word/2010/wordprocessingCanvas" xmlns:mc="http://schemas.openxmlformats.org/markup-compatibility/2006" xmlns:o="urn:schemas-microsoft-com:office:office" xmlns:r="http://schemas.openxmlformats.org/officeDocument/2006/relationships" xmlns:m="http://schemas.openxmlformats.org/officeDocument/2006/math" xmlns:v="urn:schemas-microsoft-com:vml" xmlns:wp14="http://schemas.microsoft.com/office/word/2010/wordprocessingDrawing" xmlns:wp="http://schemas.openxmlformats.org/drawingml/2006/wordprocessingDrawing" xmlns:w10="urn:schemas-microsoft-com:office:word" xmlns:w="http://schemas.openxmlformats.org/wordprocessingml/2006/main" xmlns:w14="http://schemas.microsoft.com/office/word/2010/wordml" xmlns:w15="http://schemas.microsoft.com/office/word/2012/wordml" xmlns:wpg="http://schemas.microsoft.com/office/word/2010/wordprocessingGroup" xmlns:wpi="http://schemas.microsoft.com/office/word/2010/wordprocessingInk" xmlns:wne="http://schemas.microsoft.com/office/word/2006/wordml" xmlns:wps="http://schemas.microsoft.com/office/word/2010/wordprocessingShape" mc:Ignorable="w14 w15 wp14">
+<w:ftr xmlns:wpc="http://schemas.microsoft.com/office/word/2010/wordprocessingCanvas" xmlns:cx="http://schemas.microsoft.com/office/drawing/2014/chartex" xmlns:cx1="http://schemas.microsoft.com/office/drawing/2015/9/8/chartex" xmlns:mc="http://schemas.openxmlformats.org/markup-compatibility/2006" xmlns:o="urn:schemas-microsoft-com:office:office" xmlns:r="http://schemas.openxmlformats.org/officeDocument/2006/relationships" xmlns:m="http://schemas.openxmlformats.org/officeDocument/2006/math" xmlns:v="urn:schemas-microsoft-com:vml" xmlns:wp14="http://schemas.microsoft.com/office/word/2010/wordprocessingDrawing" xmlns:wp="http://schemas.openxmlformats.org/drawingml/2006/wordprocessingDrawing" xmlns:w10="urn:schemas-microsoft-com:office:word" xmlns:w="http://schemas.openxmlformats.org/wordprocessingml/2006/main" xmlns:w14="http://schemas.microsoft.com/office/word/2010/wordml" xmlns:w15="http://schemas.microsoft.com/office/word/2012/wordml" xmlns:w16se="http://schemas.microsoft.com/office/word/2015/wordml/symex" xmlns:wpg="http://schemas.microsoft.com/office/word/2010/wordprocessingGroup" xmlns:wpi="http://schemas.microsoft.com/office/word/2010/wordprocessingInk" xmlns:wne="http://schemas.microsoft.com/office/word/2006/wordml" xmlns:wps="http://schemas.microsoft.com/office/word/2010/wordprocessingShape" mc:Ignorable="w14 w15 w16se wp14">
   <w:sdt>
     <w:sdtPr>
       <w:id w:val="503633603"/>
@@ -3449,7 +3364,7 @@
 </file>
 
 <file path=word/footnotes.xml><?xml version="1.0" encoding="utf-8"?>
-<w:footnotes xmlns:wpc="http://schemas.microsoft.com/office/word/2010/wordprocessingCanvas" xmlns:mc="http://schemas.openxmlformats.org/markup-compatibility/2006" xmlns:o="urn:schemas-microsoft-com:office:office" xmlns:r="http://schemas.openxmlformats.org/officeDocument/2006/relationships" xmlns:m="http://schemas.openxmlformats.org/officeDocument/2006/math" xmlns:v="urn:schemas-microsoft-com:vml" xmlns:wp14="http://schemas.microsoft.com/office/word/2010/wordprocessingDrawing" xmlns:wp="http://schemas.openxmlformats.org/drawingml/2006/wordprocessingDrawing" xmlns:w10="urn:schemas-microsoft-com:office:word" xmlns:w="http://schemas.openxmlformats.org/wordprocessingml/2006/main" xmlns:w14="http://schemas.microsoft.com/office/word/2010/wordml" xmlns:w15="http://schemas.microsoft.com/office/word/2012/wordml" xmlns:wpg="http://schemas.microsoft.com/office/word/2010/wordprocessingGroup" xmlns:wpi="http://schemas.microsoft.com/office/word/2010/wordprocessingInk" xmlns:wne="http://schemas.microsoft.com/office/word/2006/wordml" xmlns:wps="http://schemas.microsoft.com/office/word/2010/wordprocessingShape" mc:Ignorable="w14 w15 wp14">
+<w:footnotes xmlns:wpc="http://schemas.microsoft.com/office/word/2010/wordprocessingCanvas" xmlns:cx="http://schemas.microsoft.com/office/drawing/2014/chartex" xmlns:cx1="http://schemas.microsoft.com/office/drawing/2015/9/8/chartex" xmlns:mc="http://schemas.openxmlformats.org/markup-compatibility/2006" xmlns:o="urn:schemas-microsoft-com:office:office" xmlns:r="http://schemas.openxmlformats.org/officeDocument/2006/relationships" xmlns:m="http://schemas.openxmlformats.org/officeDocument/2006/math" xmlns:v="urn:schemas-microsoft-com:vml" xmlns:wp14="http://schemas.microsoft.com/office/word/2010/wordprocessingDrawing" xmlns:wp="http://schemas.openxmlformats.org/drawingml/2006/wordprocessingDrawing" xmlns:w10="urn:schemas-microsoft-com:office:word" xmlns:w="http://schemas.openxmlformats.org/wordprocessingml/2006/main" xmlns:w14="http://schemas.microsoft.com/office/word/2010/wordml" xmlns:w15="http://schemas.microsoft.com/office/word/2012/wordml" xmlns:w16se="http://schemas.microsoft.com/office/word/2015/wordml/symex" xmlns:wpg="http://schemas.microsoft.com/office/word/2010/wordprocessingGroup" xmlns:wpi="http://schemas.microsoft.com/office/word/2010/wordprocessingInk" xmlns:wne="http://schemas.microsoft.com/office/word/2006/wordml" xmlns:wps="http://schemas.microsoft.com/office/word/2010/wordprocessingShape" mc:Ignorable="w14 w15 w16se wp14">
   <w:footnote w:type="separator" w:id="-1">
     <w:p>
       <w:pPr>
@@ -3474,7 +3389,7 @@
 </file>
 
 <file path=word/numbering.xml><?xml version="1.0" encoding="utf-8"?>
-<w:numbering xmlns:wpc="http://schemas.microsoft.com/office/word/2010/wordprocessingCanvas" xmlns:mc="http://schemas.openxmlformats.org/markup-compatibility/2006" xmlns:o="urn:schemas-microsoft-com:office:office" xmlns:r="http://schemas.openxmlformats.org/officeDocument/2006/relationships" xmlns:m="http://schemas.openxmlformats.org/officeDocument/2006/math" xmlns:v="urn:schemas-microsoft-com:vml" xmlns:wp14="http://schemas.microsoft.com/office/word/2010/wordprocessingDrawing" xmlns:wp="http://schemas.openxmlformats.org/drawingml/2006/wordprocessingDrawing" xmlns:w10="urn:schemas-microsoft-com:office:word" xmlns:w="http://schemas.openxmlformats.org/wordprocessingml/2006/main" xmlns:w14="http://schemas.microsoft.com/office/word/2010/wordml" xmlns:w15="http://schemas.microsoft.com/office/word/2012/wordml" xmlns:wpg="http://schemas.microsoft.com/office/word/2010/wordprocessingGroup" xmlns:wpi="http://schemas.microsoft.com/office/word/2010/wordprocessingInk" xmlns:wne="http://schemas.microsoft.com/office/word/2006/wordml" xmlns:wps="http://schemas.microsoft.com/office/word/2010/wordprocessingShape" mc:Ignorable="w14 w15 wp14">
+<w:numbering xmlns:wpc="http://schemas.microsoft.com/office/word/2010/wordprocessingCanvas" xmlns:cx="http://schemas.microsoft.com/office/drawing/2014/chartex" xmlns:cx1="http://schemas.microsoft.com/office/drawing/2015/9/8/chartex" xmlns:mc="http://schemas.openxmlformats.org/markup-compatibility/2006" xmlns:o="urn:schemas-microsoft-com:office:office" xmlns:r="http://schemas.openxmlformats.org/officeDocument/2006/relationships" xmlns:m="http://schemas.openxmlformats.org/officeDocument/2006/math" xmlns:v="urn:schemas-microsoft-com:vml" xmlns:wp14="http://schemas.microsoft.com/office/word/2010/wordprocessingDrawing" xmlns:wp="http://schemas.openxmlformats.org/drawingml/2006/wordprocessingDrawing" xmlns:w10="urn:schemas-microsoft-com:office:word" xmlns:w="http://schemas.openxmlformats.org/wordprocessingml/2006/main" xmlns:w14="http://schemas.microsoft.com/office/word/2010/wordml" xmlns:w15="http://schemas.microsoft.com/office/word/2012/wordml" xmlns:w16se="http://schemas.microsoft.com/office/word/2015/wordml/symex" xmlns:wpg="http://schemas.microsoft.com/office/word/2010/wordprocessingGroup" xmlns:wpi="http://schemas.microsoft.com/office/word/2010/wordprocessingInk" xmlns:wne="http://schemas.microsoft.com/office/word/2006/wordml" xmlns:wps="http://schemas.microsoft.com/office/word/2010/wordprocessingShape" mc:Ignorable="w14 w15 w16se wp14">
   <w:abstractNum w:abstractNumId="0" w15:restartNumberingAfterBreak="0">
     <w:nsid w:val="289F0408"/>
     <w:multiLevelType w:val="hybridMultilevel"/>
@@ -3916,7 +3831,7 @@
 </file>
 
 <file path=word/styles.xml><?xml version="1.0" encoding="utf-8"?>
-<w:styles xmlns:mc="http://schemas.openxmlformats.org/markup-compatibility/2006" xmlns:r="http://schemas.openxmlformats.org/officeDocument/2006/relationships" xmlns:w="http://schemas.openxmlformats.org/wordprocessingml/2006/main" xmlns:w14="http://schemas.microsoft.com/office/word/2010/wordml" xmlns:w15="http://schemas.microsoft.com/office/word/2012/wordml" mc:Ignorable="w14 w15">
+<w:styles xmlns:mc="http://schemas.openxmlformats.org/markup-compatibility/2006" xmlns:r="http://schemas.openxmlformats.org/officeDocument/2006/relationships" xmlns:w="http://schemas.openxmlformats.org/wordprocessingml/2006/main" xmlns:w14="http://schemas.microsoft.com/office/word/2010/wordml" xmlns:w15="http://schemas.microsoft.com/office/word/2012/wordml" xmlns:w16se="http://schemas.microsoft.com/office/word/2015/wordml/symex" mc:Ignorable="w14 w15 w16se">
   <w:docDefaults>
     <w:rPrDefault>
       <w:rPr>
@@ -4421,6 +4336,11 @@
     <w:uiPriority w:val="99"/>
     <w:rsid w:val="00431C75"/>
   </w:style>
+  <w:style w:type="character" w:customStyle="1" w:styleId="textexposedshow">
+    <w:name w:val="text_exposed_show"/>
+    <w:basedOn w:val="DefaultParagraphFont"/>
+    <w:rsid w:val="00220C90"/>
+  </w:style>
 </w:styles>
 </file>
 
@@ -4690,7 +4610,7 @@
 </file>
 
 <file path=customXml/itemProps1.xml><?xml version="1.0" encoding="utf-8"?>
-<ds:datastoreItem xmlns:ds="http://schemas.openxmlformats.org/officeDocument/2006/customXml" ds:itemID="{6C0BD4C4-A510-4BED-9D46-510528C6A36D}">
+<ds:datastoreItem xmlns:ds="http://schemas.openxmlformats.org/officeDocument/2006/customXml" ds:itemID="{BC371DBB-AA0F-4270-A4BE-97F83184159C}">
   <ds:schemaRefs>
     <ds:schemaRef ds:uri="http://schemas.openxmlformats.org/officeDocument/2006/bibliography"/>
   </ds:schemaRefs>

</xml_diff>

<commit_message>
updated profile & cv
</commit_message>
<xml_diff>
--- a/files/cv.docx
+++ b/files/cv.docx
@@ -1,6 +1,6 @@
 
 <file path=word/document.xml><?xml version="1.0" encoding="utf-8"?>
-<w:document xmlns:wpc="http://schemas.microsoft.com/office/word/2010/wordprocessingCanvas" xmlns:cx="http://schemas.microsoft.com/office/drawing/2014/chartex" xmlns:cx1="http://schemas.microsoft.com/office/drawing/2015/9/8/chartex" xmlns:mc="http://schemas.openxmlformats.org/markup-compatibility/2006" xmlns:o="urn:schemas-microsoft-com:office:office" xmlns:r="http://schemas.openxmlformats.org/officeDocument/2006/relationships" xmlns:m="http://schemas.openxmlformats.org/officeDocument/2006/math" xmlns:v="urn:schemas-microsoft-com:vml" xmlns:wp14="http://schemas.microsoft.com/office/word/2010/wordprocessingDrawing" xmlns:wp="http://schemas.openxmlformats.org/drawingml/2006/wordprocessingDrawing" xmlns:w10="urn:schemas-microsoft-com:office:word" xmlns:w="http://schemas.openxmlformats.org/wordprocessingml/2006/main" xmlns:w14="http://schemas.microsoft.com/office/word/2010/wordml" xmlns:w15="http://schemas.microsoft.com/office/word/2012/wordml" xmlns:w16se="http://schemas.microsoft.com/office/word/2015/wordml/symex" xmlns:wpg="http://schemas.microsoft.com/office/word/2010/wordprocessingGroup" xmlns:wpi="http://schemas.microsoft.com/office/word/2010/wordprocessingInk" xmlns:wne="http://schemas.microsoft.com/office/word/2006/wordml" xmlns:wps="http://schemas.microsoft.com/office/word/2010/wordprocessingShape" mc:Ignorable="w14 w15 w16se wp14">
+<w:document xmlns:wpc="http://schemas.microsoft.com/office/word/2010/wordprocessingCanvas" xmlns:cx="http://schemas.microsoft.com/office/drawing/2014/chartex" xmlns:cx1="http://schemas.microsoft.com/office/drawing/2015/9/8/chartex" xmlns:cx2="http://schemas.microsoft.com/office/drawing/2015/10/21/chartex" xmlns:cx3="http://schemas.microsoft.com/office/drawing/2016/5/9/chartex" xmlns:cx4="http://schemas.microsoft.com/office/drawing/2016/5/10/chartex" xmlns:cx5="http://schemas.microsoft.com/office/drawing/2016/5/11/chartex" xmlns:mc="http://schemas.openxmlformats.org/markup-compatibility/2006" xmlns:o="urn:schemas-microsoft-com:office:office" xmlns:r="http://schemas.openxmlformats.org/officeDocument/2006/relationships" xmlns:m="http://schemas.openxmlformats.org/officeDocument/2006/math" xmlns:v="urn:schemas-microsoft-com:vml" xmlns:wp14="http://schemas.microsoft.com/office/word/2010/wordprocessingDrawing" xmlns:wp="http://schemas.openxmlformats.org/drawingml/2006/wordprocessingDrawing" xmlns:w10="urn:schemas-microsoft-com:office:word" xmlns:w="http://schemas.openxmlformats.org/wordprocessingml/2006/main" xmlns:w14="http://schemas.microsoft.com/office/word/2010/wordml" xmlns:w15="http://schemas.microsoft.com/office/word/2012/wordml" xmlns:w16se="http://schemas.microsoft.com/office/word/2015/wordml/symex" xmlns:wpg="http://schemas.microsoft.com/office/word/2010/wordprocessingGroup" xmlns:wpi="http://schemas.microsoft.com/office/word/2010/wordprocessingInk" xmlns:wne="http://schemas.microsoft.com/office/word/2006/wordml" xmlns:wps="http://schemas.microsoft.com/office/word/2010/wordprocessingShape" mc:Ignorable="w14 w15 w16se wp14">
   <w:body>
     <w:p>
       <w:pPr>
@@ -11,6 +11,7 @@
           <w:sz w:val="40"/>
         </w:rPr>
       </w:pPr>
+      <w:bookmarkStart w:id="0" w:name="_GoBack"/>
       <w:r>
         <w:rPr>
           <w:rFonts w:ascii="Times New Roman" w:hAnsi="Times New Roman" w:cs="Times New Roman"/>
@@ -97,8 +98,6 @@
               </w:rPr>
               <w:t>919.605.6175</w:t>
             </w:r>
-            <w:bookmarkStart w:id="0" w:name="_GoBack"/>
-            <w:bookmarkEnd w:id="0"/>
           </w:p>
           <w:p>
             <w:pPr>
@@ -115,30 +114,6 @@
               </w:rPr>
               <w:t>alexandriakvail.com</w:t>
             </w:r>
-            <w:r>
-              <w:rPr>
-                <w:rFonts w:ascii="Times New Roman" w:hAnsi="Times New Roman" w:cs="Times New Roman"/>
-                <w:sz w:val="20"/>
-              </w:rPr>
-              <w:br/>
-              <w:t>researchgate.net/profile/</w:t>
-            </w:r>
-            <w:proofErr w:type="spellStart"/>
-            <w:r>
-              <w:rPr>
-                <w:rFonts w:ascii="Times New Roman" w:hAnsi="Times New Roman" w:cs="Times New Roman"/>
-                <w:sz w:val="20"/>
-              </w:rPr>
-              <w:t>alexandria_v</w:t>
-            </w:r>
-            <w:r>
-              <w:rPr>
-                <w:rFonts w:ascii="Times New Roman" w:hAnsi="Times New Roman" w:cs="Times New Roman"/>
-                <w:sz w:val="20"/>
-              </w:rPr>
-              <w:t>ail</w:t>
-            </w:r>
-            <w:proofErr w:type="spellEnd"/>
           </w:p>
         </w:tc>
         <w:tc>
@@ -190,22 +165,6 @@
                 <w:rFonts w:ascii="Times New Roman" w:hAnsi="Times New Roman" w:cs="Times New Roman"/>
                 <w:sz w:val="20"/>
               </w:rPr>
-              <w:t>Newell-Simon Hall</w:t>
-            </w:r>
-          </w:p>
-          <w:p>
-            <w:pPr>
-              <w:jc w:val="center"/>
-              <w:rPr>
-                <w:rFonts w:ascii="Times New Roman" w:hAnsi="Times New Roman" w:cs="Times New Roman"/>
-                <w:sz w:val="20"/>
-              </w:rPr>
-            </w:pPr>
-            <w:r>
-              <w:rPr>
-                <w:rFonts w:ascii="Times New Roman" w:hAnsi="Times New Roman" w:cs="Times New Roman"/>
-                <w:sz w:val="20"/>
-              </w:rPr>
               <w:t>Pittsburgh, PA 15213-3815</w:t>
             </w:r>
           </w:p>
@@ -214,15 +173,6 @@
     </w:tbl>
     <w:p>
       <w:pPr>
-        <w:jc w:val="center"/>
-        <w:rPr>
-          <w:rFonts w:ascii="Times New Roman" w:hAnsi="Times New Roman" w:cs="Times New Roman"/>
-          <w:sz w:val="20"/>
-        </w:rPr>
-      </w:pPr>
-    </w:p>
-    <w:p>
-      <w:pPr>
         <w:rPr>
           <w:rFonts w:ascii="Times New Roman" w:hAnsi="Times New Roman" w:cs="Times New Roman"/>
           <w:b/>
@@ -277,6 +227,21 @@
         <w:br/>
         <w:t>Carnegie Mellon University</w:t>
       </w:r>
+      <w:r>
+        <w:rPr>
+          <w:rFonts w:ascii="Times New Roman" w:hAnsi="Times New Roman" w:cs="Times New Roman"/>
+        </w:rPr>
+        <w:br/>
+        <w:t xml:space="preserve">Advisor: Dr. Louis-Philippe </w:t>
+      </w:r>
+      <w:proofErr w:type="spellStart"/>
+      <w:r>
+        <w:rPr>
+          <w:rFonts w:ascii="Times New Roman" w:hAnsi="Times New Roman" w:cs="Times New Roman"/>
+        </w:rPr>
+        <w:t>Morency</w:t>
+      </w:r>
+      <w:proofErr w:type="spellEnd"/>
     </w:p>
     <w:p>
       <w:pPr>
@@ -391,14 +356,7 @@
           <w:rFonts w:ascii="Times New Roman" w:hAnsi="Times New Roman" w:cs="Times New Roman"/>
           <w:i/>
         </w:rPr>
-        <w:t xml:space="preserve"> </w:t>
-      </w:r>
-      <w:r>
-        <w:rPr>
-          <w:rFonts w:ascii="Times New Roman" w:hAnsi="Times New Roman" w:cs="Times New Roman"/>
-          <w:i/>
-        </w:rPr>
-        <w:t>magna cum laude</w:t>
+        <w:t xml:space="preserve"> magna cum laude</w:t>
       </w:r>
       <w:r>
         <w:rPr>
@@ -425,13 +383,7 @@
         <w:rPr>
           <w:rFonts w:ascii="Times New Roman" w:hAnsi="Times New Roman" w:cs="Times New Roman"/>
         </w:rPr>
-        <w:t>Minor concentrations: Cognitive Science, Ph</w:t>
-      </w:r>
-      <w:r>
-        <w:rPr>
-          <w:rFonts w:ascii="Times New Roman" w:hAnsi="Times New Roman" w:cs="Times New Roman"/>
-        </w:rPr>
-        <w:t>ysics</w:t>
+        <w:t>Minor concentrations: Cognitive Science, Physics</w:t>
       </w:r>
       <w:r>
         <w:rPr>
@@ -494,14 +446,7 @@
           <w:rFonts w:ascii="Times New Roman" w:hAnsi="Times New Roman" w:cs="Times New Roman"/>
           <w:b/>
         </w:rPr>
-        <w:t>Graduate</w:t>
-      </w:r>
-      <w:r>
-        <w:rPr>
-          <w:rFonts w:ascii="Times New Roman" w:hAnsi="Times New Roman" w:cs="Times New Roman"/>
-          <w:b/>
-        </w:rPr>
-        <w:t xml:space="preserve"> Research Assistant</w:t>
+        <w:t>Graduate Research Assistant</w:t>
       </w:r>
       <w:r>
         <w:rPr>
@@ -516,6 +461,27 @@
         <w:br/>
         <w:t>Carnegie Mellon University</w:t>
       </w:r>
+      <w:r>
+        <w:rPr>
+          <w:rFonts w:ascii="Times New Roman" w:hAnsi="Times New Roman" w:cs="Times New Roman"/>
+        </w:rPr>
+        <w:br/>
+        <w:t xml:space="preserve">The </w:t>
+      </w:r>
+      <w:proofErr w:type="spellStart"/>
+      <w:r>
+        <w:rPr>
+          <w:rFonts w:ascii="Times New Roman" w:hAnsi="Times New Roman" w:cs="Times New Roman"/>
+        </w:rPr>
+        <w:t>MultiComp</w:t>
+      </w:r>
+      <w:proofErr w:type="spellEnd"/>
+      <w:r>
+        <w:rPr>
+          <w:rFonts w:ascii="Times New Roman" w:hAnsi="Times New Roman" w:cs="Times New Roman"/>
+        </w:rPr>
+        <w:t xml:space="preserve"> Lab</w:t>
+      </w:r>
     </w:p>
     <w:p>
       <w:pPr>
@@ -547,14 +513,7 @@
           <w:rFonts w:ascii="Times New Roman" w:hAnsi="Times New Roman" w:cs="Times New Roman"/>
           <w:b/>
         </w:rPr>
-        <w:t>Graduate</w:t>
-      </w:r>
-      <w:r>
-        <w:rPr>
-          <w:rFonts w:ascii="Times New Roman" w:hAnsi="Times New Roman" w:cs="Times New Roman"/>
-          <w:b/>
-        </w:rPr>
-        <w:t xml:space="preserve"> Research Assistant</w:t>
+        <w:t>Graduate Research Assistant</w:t>
       </w:r>
       <w:r>
         <w:rPr>
@@ -588,13 +547,7 @@
         <w:rPr>
           <w:rFonts w:ascii="Times New Roman" w:hAnsi="Times New Roman" w:cs="Times New Roman"/>
         </w:rPr>
-        <w:t>2013</w:t>
-      </w:r>
-      <w:r>
-        <w:rPr>
-          <w:rFonts w:ascii="Times New Roman" w:hAnsi="Times New Roman" w:cs="Times New Roman"/>
-        </w:rPr>
-        <w:t xml:space="preserve"> – 2015</w:t>
+        <w:t>2013 – 2015</w:t>
       </w:r>
       <w:r>
         <w:rPr>
@@ -711,7 +664,13 @@
         <w:rPr>
           <w:rFonts w:ascii="Times New Roman" w:hAnsi="Times New Roman" w:cs="Times New Roman"/>
         </w:rPr>
-        <w:t>: user modeling, affective computing, AI &amp; education</w:t>
+        <w:t xml:space="preserve">: user modeling, affective computing, </w:t>
+      </w:r>
+      <w:r>
+        <w:rPr>
+          <w:rFonts w:ascii="Times New Roman" w:hAnsi="Times New Roman" w:cs="Times New Roman"/>
+        </w:rPr>
+        <w:t>AI &amp; education, multimodal behavior analysis</w:t>
       </w:r>
     </w:p>
     <w:p>
@@ -737,7 +696,13 @@
         <w:rPr>
           <w:rFonts w:ascii="Times New Roman" w:hAnsi="Times New Roman" w:cs="Times New Roman"/>
         </w:rPr>
-        <w:t>: intelligent tutoring systems, pedagogical agents, tutorial dialogue, game-based learning environments</w:t>
+        <w:t>: intelligent tutoring systems</w:t>
+      </w:r>
+      <w:r>
+        <w:rPr>
+          <w:rFonts w:ascii="Times New Roman" w:hAnsi="Times New Roman" w:cs="Times New Roman"/>
+        </w:rPr>
+        <w:t>, tutorial dialogue, game-based learning environments</w:t>
       </w:r>
     </w:p>
     <w:p>
@@ -765,15 +730,6 @@
         </w:rPr>
         <w:t>: natural language understanding, natural language dialogue systems</w:t>
       </w:r>
-    </w:p>
-    <w:p>
-      <w:pPr>
-        <w:rPr>
-          <w:rFonts w:ascii="Times New Roman" w:hAnsi="Times New Roman" w:cs="Times New Roman"/>
-          <w:b/>
-          <w:sz w:val="28"/>
-        </w:rPr>
-      </w:pPr>
     </w:p>
     <w:p>
       <w:pPr>
@@ -1151,14 +1107,7 @@
           <w:rFonts w:ascii="Times New Roman" w:hAnsi="Times New Roman" w:cs="Times New Roman"/>
           <w:i/>
         </w:rPr>
-        <w:t>Proceedings of the Twenty-Four</w:t>
-      </w:r>
-      <w:r>
-        <w:rPr>
-          <w:rFonts w:ascii="Times New Roman" w:hAnsi="Times New Roman" w:cs="Times New Roman"/>
-          <w:i/>
-        </w:rPr>
-        <w:t>th International Conference on User Modelling, Adaptation, and Personalization (UMAP 2016)</w:t>
+        <w:t>Proceedings of the Twenty-Fourth International Conference on User Modelling, Adaptation, and Personalization (UMAP 2016)</w:t>
       </w:r>
       <w:r>
         <w:rPr>
@@ -1268,13 +1217,7 @@
         <w:rPr>
           <w:rFonts w:ascii="Times New Roman" w:hAnsi="Times New Roman" w:cs="Times New Roman"/>
         </w:rPr>
-        <w:t>, Raleigh, North Carolina, 2016.</w:t>
-      </w:r>
-      <w:r>
-        <w:rPr>
-          <w:rFonts w:ascii="Times New Roman" w:hAnsi="Times New Roman" w:cs="Times New Roman"/>
-        </w:rPr>
-        <w:t xml:space="preserve"> (long paper, acceptance rate: 27.5%)</w:t>
+        <w:t>, Raleigh, North Carolina, 2016. (long paper, acceptance rate: 27.5%)</w:t>
       </w:r>
       <w:r>
         <w:rPr>
@@ -1403,13 +1346,7 @@
         <w:rPr>
           <w:rFonts w:ascii="Times New Roman" w:hAnsi="Times New Roman" w:cs="Times New Roman"/>
         </w:rPr>
-        <w:t>, Raleigh, North Carolina, 2016.</w:t>
-      </w:r>
-      <w:r>
-        <w:rPr>
-          <w:rFonts w:ascii="Times New Roman" w:hAnsi="Times New Roman" w:cs="Times New Roman"/>
-        </w:rPr>
-        <w:t xml:space="preserve"> (short paper, acceptance rate: 52%)</w:t>
+        <w:t>, Raleigh, North Carolina, 2016. (short paper, acceptance rate: 52%)</w:t>
       </w:r>
     </w:p>
     <w:p>
@@ -1430,26 +1367,13 @@
           <w:rFonts w:ascii="Times New Roman" w:hAnsi="Times New Roman" w:cs="Times New Roman"/>
           <w:b/>
         </w:rPr>
-        <w:t>A</w:t>
-      </w:r>
-      <w:r>
-        <w:rPr>
-          <w:rFonts w:ascii="Times New Roman" w:hAnsi="Times New Roman" w:cs="Times New Roman"/>
-          <w:b/>
-        </w:rPr>
-        <w:t>. Vail</w:t>
-      </w:r>
-      <w:r>
-        <w:rPr>
-          <w:rFonts w:ascii="Times New Roman" w:hAnsi="Times New Roman" w:cs="Times New Roman"/>
-        </w:rPr>
-        <w:t xml:space="preserve">, </w:t>
-      </w:r>
-      <w:r>
-        <w:rPr>
-          <w:rFonts w:ascii="Times New Roman" w:hAnsi="Times New Roman" w:cs="Times New Roman"/>
-        </w:rPr>
-        <w:t xml:space="preserve">J. Grafsgaard, K. Boyer, E. Wiebe, and J. Lester. Predicting Learning from Student Affective Response to Tutor Questions. </w:t>
+        <w:t>A. Vail</w:t>
+      </w:r>
+      <w:r>
+        <w:rPr>
+          <w:rFonts w:ascii="Times New Roman" w:hAnsi="Times New Roman" w:cs="Times New Roman"/>
+        </w:rPr>
+        <w:t xml:space="preserve">, J. Grafsgaard, K. Boyer, E. Wiebe, and J. Lester. Predicting Learning from Student Affective Response to Tutor Questions. </w:t>
       </w:r>
       <w:r>
         <w:rPr>
@@ -1557,19 +1481,7 @@
         <w:rPr>
           <w:rFonts w:ascii="Times New Roman" w:hAnsi="Times New Roman" w:cs="Times New Roman"/>
         </w:rPr>
-        <w:t>227, Dublin, Ireland, 2015. (</w:t>
-      </w:r>
-      <w:r>
-        <w:rPr>
-          <w:rFonts w:ascii="Times New Roman" w:hAnsi="Times New Roman" w:cs="Times New Roman"/>
-        </w:rPr>
-        <w:t xml:space="preserve">long paper, </w:t>
-      </w:r>
-      <w:r>
-        <w:rPr>
-          <w:rFonts w:ascii="Times New Roman" w:hAnsi="Times New Roman" w:cs="Times New Roman"/>
-        </w:rPr>
-        <w:t>acceptance rate: 28%)</w:t>
+        <w:t>227, Dublin, Ireland, 2015. (long paper, acceptance rate: 28%)</w:t>
       </w:r>
     </w:p>
     <w:p>
@@ -2146,6 +2058,7 @@
           </w:tcPr>
           <w:p>
             <w:pPr>
+              <w:ind w:left="345" w:hanging="345"/>
               <w:rPr>
                 <w:rFonts w:ascii="Times New Roman" w:hAnsi="Times New Roman" w:cs="Times New Roman"/>
               </w:rPr>
@@ -2159,6 +2072,7 @@
           </w:p>
           <w:p>
             <w:pPr>
+              <w:ind w:left="345" w:hanging="345"/>
               <w:rPr>
                 <w:rFonts w:ascii="Times New Roman" w:hAnsi="Times New Roman" w:cs="Times New Roman"/>
               </w:rPr>
@@ -2172,6 +2086,7 @@
           </w:p>
           <w:p>
             <w:pPr>
+              <w:ind w:left="345" w:hanging="345"/>
               <w:rPr>
                 <w:rFonts w:ascii="Times New Roman" w:hAnsi="Times New Roman" w:cs="Times New Roman"/>
               </w:rPr>
@@ -2185,15 +2100,36 @@
           </w:p>
           <w:p>
             <w:pPr>
-              <w:rPr>
-                <w:rFonts w:ascii="Times New Roman" w:hAnsi="Times New Roman" w:cs="Times New Roman"/>
-              </w:rPr>
-            </w:pPr>
-            <w:r>
-              <w:rPr>
-                <w:rFonts w:ascii="Times New Roman" w:hAnsi="Times New Roman" w:cs="Times New Roman"/>
-              </w:rPr>
-              <w:t>Artificial Intelligence I, II</w:t>
+              <w:ind w:left="345" w:hanging="345"/>
+              <w:rPr>
+                <w:rFonts w:ascii="Times New Roman" w:hAnsi="Times New Roman" w:cs="Times New Roman"/>
+              </w:rPr>
+            </w:pPr>
+            <w:r>
+              <w:rPr>
+                <w:rFonts w:ascii="Times New Roman" w:hAnsi="Times New Roman" w:cs="Times New Roman"/>
+              </w:rPr>
+              <w:t>Reasoning U</w:t>
+            </w:r>
+            <w:r>
+              <w:rPr>
+                <w:rFonts w:ascii="Times New Roman" w:hAnsi="Times New Roman" w:cs="Times New Roman"/>
+              </w:rPr>
+              <w:t>nder Uncertainty</w:t>
+            </w:r>
+          </w:p>
+          <w:p>
+            <w:pPr>
+              <w:ind w:left="345" w:hanging="345"/>
+              <w:rPr>
+                <w:rFonts w:ascii="Times New Roman" w:hAnsi="Times New Roman" w:cs="Times New Roman"/>
+              </w:rPr>
+            </w:pPr>
+            <w:r>
+              <w:rPr>
+                <w:rFonts w:ascii="Times New Roman" w:hAnsi="Times New Roman" w:cs="Times New Roman"/>
+              </w:rPr>
+              <w:t>Human Communication and Multimodal Computation</w:t>
             </w:r>
           </w:p>
         </w:tc>
@@ -2203,6 +2139,20 @@
           </w:tcPr>
           <w:p>
             <w:pPr>
+              <w:ind w:left="345" w:hanging="345"/>
+              <w:rPr>
+                <w:rFonts w:ascii="Times New Roman" w:hAnsi="Times New Roman" w:cs="Times New Roman"/>
+              </w:rPr>
+            </w:pPr>
+            <w:r>
+              <w:rPr>
+                <w:rFonts w:ascii="Times New Roman" w:hAnsi="Times New Roman" w:cs="Times New Roman"/>
+              </w:rPr>
+              <w:t>Artificial Intelligence I, II</w:t>
+            </w:r>
+          </w:p>
+          <w:p>
+            <w:pPr>
               <w:rPr>
                 <w:rFonts w:ascii="Times New Roman" w:hAnsi="Times New Roman" w:cs="Times New Roman"/>
               </w:rPr>
@@ -2238,6 +2188,32 @@
                 <w:rFonts w:ascii="Times New Roman" w:hAnsi="Times New Roman" w:cs="Times New Roman"/>
               </w:rPr>
               <w:t>Graph Theory</w:t>
+            </w:r>
+          </w:p>
+          <w:p>
+            <w:pPr>
+              <w:rPr>
+                <w:rFonts w:ascii="Times New Roman" w:hAnsi="Times New Roman" w:cs="Times New Roman"/>
+              </w:rPr>
+            </w:pPr>
+            <w:r>
+              <w:rPr>
+                <w:rFonts w:ascii="Times New Roman" w:hAnsi="Times New Roman" w:cs="Times New Roman"/>
+              </w:rPr>
+              <w:t>Automated Learning and Data Analysis</w:t>
+            </w:r>
+          </w:p>
+          <w:p>
+            <w:pPr>
+              <w:rPr>
+                <w:rFonts w:ascii="Times New Roman" w:hAnsi="Times New Roman" w:cs="Times New Roman"/>
+              </w:rPr>
+            </w:pPr>
+            <w:r>
+              <w:rPr>
+                <w:rFonts w:ascii="Times New Roman" w:hAnsi="Times New Roman" w:cs="Times New Roman"/>
+              </w:rPr>
+              <w:t>Process and Theory in HCI</w:t>
             </w:r>
           </w:p>
         </w:tc>
@@ -2316,6 +2292,7 @@
               <w:rPr>
                 <w:rFonts w:ascii="Times New Roman" w:hAnsi="Times New Roman" w:cs="Times New Roman"/>
               </w:rPr>
+              <w:lastRenderedPageBreak/>
               <w:t>C and Software Tools</w:t>
             </w:r>
           </w:p>
@@ -2330,7 +2307,6 @@
               <w:rPr>
                 <w:rFonts w:ascii="Times New Roman" w:hAnsi="Times New Roman" w:cs="Times New Roman"/>
               </w:rPr>
-              <w:lastRenderedPageBreak/>
               <w:t>Concepts and Facilities of Operating Systems for Computer Scientists</w:t>
             </w:r>
           </w:p>
@@ -2400,6 +2376,9 @@
           </w:p>
           <w:p>
             <w:pPr>
+              <w:tabs>
+                <w:tab w:val="center" w:pos="1764"/>
+              </w:tabs>
               <w:ind w:left="342" w:hanging="342"/>
               <w:rPr>
                 <w:rFonts w:ascii="Times New Roman" w:hAnsi="Times New Roman" w:cs="Times New Roman"/>
@@ -2409,11 +2388,14 @@
               <w:rPr>
                 <w:rFonts w:ascii="Times New Roman" w:hAnsi="Times New Roman" w:cs="Times New Roman"/>
               </w:rPr>
-              <w:t>Introduction to Language &amp; Linguistics</w:t>
-            </w:r>
-          </w:p>
-          <w:p>
-            <w:pPr>
+              <w:t>Technology &amp; American Culture</w:t>
+            </w:r>
+          </w:p>
+          <w:p>
+            <w:pPr>
+              <w:tabs>
+                <w:tab w:val="center" w:pos="1764"/>
+              </w:tabs>
               <w:ind w:left="342" w:hanging="342"/>
               <w:rPr>
                 <w:rFonts w:ascii="Times New Roman" w:hAnsi="Times New Roman" w:cs="Times New Roman"/>
@@ -2423,11 +2405,14 @@
               <w:rPr>
                 <w:rFonts w:ascii="Times New Roman" w:hAnsi="Times New Roman" w:cs="Times New Roman"/>
               </w:rPr>
-              <w:t>Introduction to Cognitive Science</w:t>
-            </w:r>
-          </w:p>
-          <w:p>
-            <w:pPr>
+              <w:t>The Creative Process in Science</w:t>
+            </w:r>
+          </w:p>
+          <w:p>
+            <w:pPr>
+              <w:tabs>
+                <w:tab w:val="center" w:pos="1764"/>
+              </w:tabs>
               <w:ind w:left="342" w:hanging="342"/>
               <w:rPr>
                 <w:rFonts w:ascii="Times New Roman" w:hAnsi="Times New Roman" w:cs="Times New Roman"/>
@@ -2437,7 +2422,7 @@
               <w:rPr>
                 <w:rFonts w:ascii="Times New Roman" w:hAnsi="Times New Roman" w:cs="Times New Roman"/>
               </w:rPr>
-              <w:t>Introduction to Psychology</w:t>
+              <w:t>Self, Schooling, &amp; Social Order</w:t>
             </w:r>
           </w:p>
           <w:p>
@@ -2451,7 +2436,7 @@
               <w:rPr>
                 <w:rFonts w:ascii="Times New Roman" w:hAnsi="Times New Roman" w:cs="Times New Roman"/>
               </w:rPr>
-              <w:t>Cognitive Processes</w:t>
+              <w:t>Introduction to College Tutoring</w:t>
             </w:r>
           </w:p>
         </w:tc>
@@ -2499,6 +2484,7 @@
               <w:rPr>
                 <w:rFonts w:ascii="Times New Roman" w:hAnsi="Times New Roman" w:cs="Times New Roman"/>
               </w:rPr>
+              <w:lastRenderedPageBreak/>
               <w:t>Applied Differential Equations I</w:t>
             </w:r>
           </w:p>
@@ -2530,7 +2516,6 @@
               <w:rPr>
                 <w:rFonts w:ascii="Times New Roman" w:hAnsi="Times New Roman" w:cs="Times New Roman"/>
               </w:rPr>
-              <w:lastRenderedPageBreak/>
               <w:t>Introduction to Modern Algebra for Mathematicians</w:t>
             </w:r>
           </w:p>
@@ -2595,6 +2580,20 @@
           </w:p>
           <w:p>
             <w:pPr>
+              <w:ind w:left="342" w:hanging="342"/>
+              <w:rPr>
+                <w:rFonts w:ascii="Times New Roman" w:hAnsi="Times New Roman" w:cs="Times New Roman"/>
+              </w:rPr>
+            </w:pPr>
+            <w:r>
+              <w:rPr>
+                <w:rFonts w:ascii="Times New Roman" w:hAnsi="Times New Roman" w:cs="Times New Roman"/>
+              </w:rPr>
+              <w:t>Symbolic Logic</w:t>
+            </w:r>
+          </w:p>
+          <w:p>
+            <w:pPr>
               <w:tabs>
                 <w:tab w:val="center" w:pos="1764"/>
               </w:tabs>
@@ -2606,6 +2605,48 @@
           </w:p>
           <w:p>
             <w:pPr>
+              <w:ind w:left="342" w:hanging="342"/>
+              <w:rPr>
+                <w:rFonts w:ascii="Times New Roman" w:hAnsi="Times New Roman" w:cs="Times New Roman"/>
+              </w:rPr>
+            </w:pPr>
+            <w:r>
+              <w:rPr>
+                <w:rFonts w:ascii="Times New Roman" w:hAnsi="Times New Roman" w:cs="Times New Roman"/>
+              </w:rPr>
+              <w:t>Introduction to Language &amp; Linguistics</w:t>
+            </w:r>
+          </w:p>
+          <w:p>
+            <w:pPr>
+              <w:ind w:left="342" w:hanging="342"/>
+              <w:rPr>
+                <w:rFonts w:ascii="Times New Roman" w:hAnsi="Times New Roman" w:cs="Times New Roman"/>
+              </w:rPr>
+            </w:pPr>
+            <w:r>
+              <w:rPr>
+                <w:rFonts w:ascii="Times New Roman" w:hAnsi="Times New Roman" w:cs="Times New Roman"/>
+              </w:rPr>
+              <w:t>Introduction to Cognitive Science</w:t>
+            </w:r>
+          </w:p>
+          <w:p>
+            <w:pPr>
+              <w:ind w:left="342" w:hanging="342"/>
+              <w:rPr>
+                <w:rFonts w:ascii="Times New Roman" w:hAnsi="Times New Roman" w:cs="Times New Roman"/>
+              </w:rPr>
+            </w:pPr>
+            <w:r>
+              <w:rPr>
+                <w:rFonts w:ascii="Times New Roman" w:hAnsi="Times New Roman" w:cs="Times New Roman"/>
+              </w:rPr>
+              <w:t>Introduction to Psychology</w:t>
+            </w:r>
+          </w:p>
+          <w:p>
+            <w:pPr>
               <w:tabs>
                 <w:tab w:val="center" w:pos="1764"/>
               </w:tabs>
@@ -2618,7 +2659,7 @@
               <w:rPr>
                 <w:rFonts w:ascii="Times New Roman" w:hAnsi="Times New Roman" w:cs="Times New Roman"/>
               </w:rPr>
-              <w:t>Technology &amp; American Culture</w:t>
+              <w:t>Cognitive Processes</w:t>
             </w:r>
           </w:p>
           <w:p>
@@ -2631,46 +2672,6 @@
                 <w:rFonts w:ascii="Times New Roman" w:hAnsi="Times New Roman" w:cs="Times New Roman"/>
               </w:rPr>
             </w:pPr>
-            <w:r>
-              <w:rPr>
-                <w:rFonts w:ascii="Times New Roman" w:hAnsi="Times New Roman" w:cs="Times New Roman"/>
-              </w:rPr>
-              <w:t>The Creative Process in Science</w:t>
-            </w:r>
-          </w:p>
-          <w:p>
-            <w:pPr>
-              <w:tabs>
-                <w:tab w:val="center" w:pos="1764"/>
-              </w:tabs>
-              <w:ind w:left="342" w:hanging="342"/>
-              <w:rPr>
-                <w:rFonts w:ascii="Times New Roman" w:hAnsi="Times New Roman" w:cs="Times New Roman"/>
-              </w:rPr>
-            </w:pPr>
-            <w:r>
-              <w:rPr>
-                <w:rFonts w:ascii="Times New Roman" w:hAnsi="Times New Roman" w:cs="Times New Roman"/>
-              </w:rPr>
-              <w:t>Self, Schooling, &amp; Social Order</w:t>
-            </w:r>
-          </w:p>
-          <w:p>
-            <w:pPr>
-              <w:tabs>
-                <w:tab w:val="center" w:pos="1764"/>
-              </w:tabs>
-              <w:ind w:left="342" w:hanging="342"/>
-              <w:rPr>
-                <w:rFonts w:ascii="Times New Roman" w:hAnsi="Times New Roman" w:cs="Times New Roman"/>
-              </w:rPr>
-            </w:pPr>
-            <w:r>
-              <w:rPr>
-                <w:rFonts w:ascii="Times New Roman" w:hAnsi="Times New Roman" w:cs="Times New Roman"/>
-              </w:rPr>
-              <w:t>Introduction to College Tutoring</w:t>
-            </w:r>
           </w:p>
         </w:tc>
       </w:tr>
@@ -2700,14 +2701,6 @@
           <w:sz w:val="28"/>
         </w:rPr>
         <w:t>Membership</w:t>
-      </w:r>
-      <w:r>
-        <w:rPr>
-          <w:rFonts w:ascii="Times New Roman" w:hAnsi="Times New Roman" w:cs="Times New Roman"/>
-          <w:b/>
-          <w:sz w:val="28"/>
-        </w:rPr>
-        <w:tab/>
       </w:r>
     </w:p>
     <w:p>
@@ -3019,14 +3012,7 @@
                 <w:rFonts w:ascii="Times New Roman" w:hAnsi="Times New Roman" w:cs="Times New Roman"/>
                 <w:sz w:val="20"/>
               </w:rPr>
-              <w:t xml:space="preserve">Distinguished Professor </w:t>
-            </w:r>
-            <w:r>
-              <w:rPr>
-                <w:rFonts w:ascii="Times New Roman" w:hAnsi="Times New Roman" w:cs="Times New Roman"/>
-                <w:sz w:val="20"/>
-              </w:rPr>
-              <w:t xml:space="preserve">&amp; </w:t>
+              <w:t xml:space="preserve">Distinguished Professor &amp; </w:t>
             </w:r>
             <w:r>
               <w:rPr>
@@ -3206,6 +3192,7 @@
           </w:p>
         </w:tc>
       </w:tr>
+      <w:bookmarkEnd w:id="0"/>
     </w:tbl>
     <w:p>
       <w:pPr>
@@ -3226,7 +3213,7 @@
 </file>
 
 <file path=word/endnotes.xml><?xml version="1.0" encoding="utf-8"?>
-<w:endnotes xmlns:wpc="http://schemas.microsoft.com/office/word/2010/wordprocessingCanvas" xmlns:cx="http://schemas.microsoft.com/office/drawing/2014/chartex" xmlns:cx1="http://schemas.microsoft.com/office/drawing/2015/9/8/chartex" xmlns:mc="http://schemas.openxmlformats.org/markup-compatibility/2006" xmlns:o="urn:schemas-microsoft-com:office:office" xmlns:r="http://schemas.openxmlformats.org/officeDocument/2006/relationships" xmlns:m="http://schemas.openxmlformats.org/officeDocument/2006/math" xmlns:v="urn:schemas-microsoft-com:vml" xmlns:wp14="http://schemas.microsoft.com/office/word/2010/wordprocessingDrawing" xmlns:wp="http://schemas.openxmlformats.org/drawingml/2006/wordprocessingDrawing" xmlns:w10="urn:schemas-microsoft-com:office:word" xmlns:w="http://schemas.openxmlformats.org/wordprocessingml/2006/main" xmlns:w14="http://schemas.microsoft.com/office/word/2010/wordml" xmlns:w15="http://schemas.microsoft.com/office/word/2012/wordml" xmlns:w16se="http://schemas.microsoft.com/office/word/2015/wordml/symex" xmlns:wpg="http://schemas.microsoft.com/office/word/2010/wordprocessingGroup" xmlns:wpi="http://schemas.microsoft.com/office/word/2010/wordprocessingInk" xmlns:wne="http://schemas.microsoft.com/office/word/2006/wordml" xmlns:wps="http://schemas.microsoft.com/office/word/2010/wordprocessingShape" mc:Ignorable="w14 w15 w16se wp14">
+<w:endnotes xmlns:wpc="http://schemas.microsoft.com/office/word/2010/wordprocessingCanvas" xmlns:cx="http://schemas.microsoft.com/office/drawing/2014/chartex" xmlns:cx1="http://schemas.microsoft.com/office/drawing/2015/9/8/chartex" xmlns:cx2="http://schemas.microsoft.com/office/drawing/2015/10/21/chartex" xmlns:cx3="http://schemas.microsoft.com/office/drawing/2016/5/9/chartex" xmlns:cx4="http://schemas.microsoft.com/office/drawing/2016/5/10/chartex" xmlns:cx5="http://schemas.microsoft.com/office/drawing/2016/5/11/chartex" xmlns:mc="http://schemas.openxmlformats.org/markup-compatibility/2006" xmlns:o="urn:schemas-microsoft-com:office:office" xmlns:r="http://schemas.openxmlformats.org/officeDocument/2006/relationships" xmlns:m="http://schemas.openxmlformats.org/officeDocument/2006/math" xmlns:v="urn:schemas-microsoft-com:vml" xmlns:wp14="http://schemas.microsoft.com/office/word/2010/wordprocessingDrawing" xmlns:wp="http://schemas.openxmlformats.org/drawingml/2006/wordprocessingDrawing" xmlns:w10="urn:schemas-microsoft-com:office:word" xmlns:w="http://schemas.openxmlformats.org/wordprocessingml/2006/main" xmlns:w14="http://schemas.microsoft.com/office/word/2010/wordml" xmlns:w15="http://schemas.microsoft.com/office/word/2012/wordml" xmlns:w16se="http://schemas.microsoft.com/office/word/2015/wordml/symex" xmlns:wpg="http://schemas.microsoft.com/office/word/2010/wordprocessingGroup" xmlns:wpi="http://schemas.microsoft.com/office/word/2010/wordprocessingInk" xmlns:wne="http://schemas.microsoft.com/office/word/2006/wordml" xmlns:wps="http://schemas.microsoft.com/office/word/2010/wordprocessingShape" mc:Ignorable="w14 w15 w16se wp14">
   <w:endnote w:type="separator" w:id="-1">
     <w:p>
       <w:pPr>
@@ -3251,120 +3238,189 @@
 </file>
 
 <file path=word/footer1.xml><?xml version="1.0" encoding="utf-8"?>
-<w:ftr xmlns:wpc="http://schemas.microsoft.com/office/word/2010/wordprocessingCanvas" xmlns:cx="http://schemas.microsoft.com/office/drawing/2014/chartex" xmlns:cx1="http://schemas.microsoft.com/office/drawing/2015/9/8/chartex" xmlns:mc="http://schemas.openxmlformats.org/markup-compatibility/2006" xmlns:o="urn:schemas-microsoft-com:office:office" xmlns:r="http://schemas.openxmlformats.org/officeDocument/2006/relationships" xmlns:m="http://schemas.openxmlformats.org/officeDocument/2006/math" xmlns:v="urn:schemas-microsoft-com:vml" xmlns:wp14="http://schemas.microsoft.com/office/word/2010/wordprocessingDrawing" xmlns:wp="http://schemas.openxmlformats.org/drawingml/2006/wordprocessingDrawing" xmlns:w10="urn:schemas-microsoft-com:office:word" xmlns:w="http://schemas.openxmlformats.org/wordprocessingml/2006/main" xmlns:w14="http://schemas.microsoft.com/office/word/2010/wordml" xmlns:w15="http://schemas.microsoft.com/office/word/2012/wordml" xmlns:w16se="http://schemas.microsoft.com/office/word/2015/wordml/symex" xmlns:wpg="http://schemas.microsoft.com/office/word/2010/wordprocessingGroup" xmlns:wpi="http://schemas.microsoft.com/office/word/2010/wordprocessingInk" xmlns:wne="http://schemas.microsoft.com/office/word/2006/wordml" xmlns:wps="http://schemas.microsoft.com/office/word/2010/wordprocessingShape" mc:Ignorable="w14 w15 w16se wp14">
-  <w:sdt>
-    <w:sdtPr>
-      <w:id w:val="503633603"/>
-      <w:docPartObj>
-        <w:docPartGallery w:val="Page Numbers (Bottom of Page)"/>
-        <w:docPartUnique/>
-      </w:docPartObj>
-    </w:sdtPr>
-    <w:sdtEndPr/>
-    <w:sdtContent>
-      <w:sdt>
-        <w:sdtPr>
-          <w:id w:val="-1769616900"/>
-          <w:docPartObj>
-            <w:docPartGallery w:val="Page Numbers (Top of Page)"/>
-            <w:docPartUnique/>
-          </w:docPartObj>
-        </w:sdtPr>
-        <w:sdtEndPr/>
-        <w:sdtContent>
-          <w:p>
-            <w:pPr>
-              <w:pStyle w:val="Footer"/>
-              <w:jc w:val="right"/>
-            </w:pPr>
-            <w:r>
-              <w:rPr>
-                <w:rFonts w:ascii="Times New Roman" w:hAnsi="Times New Roman" w:cs="Times New Roman"/>
-                <w:bCs/>
-              </w:rPr>
-              <w:fldChar w:fldCharType="begin"/>
-            </w:r>
-            <w:r>
-              <w:rPr>
-                <w:rFonts w:ascii="Times New Roman" w:hAnsi="Times New Roman" w:cs="Times New Roman"/>
-                <w:bCs/>
-              </w:rPr>
-              <w:instrText xml:space="preserve"> PAGE </w:instrText>
-            </w:r>
-            <w:r>
-              <w:rPr>
-                <w:rFonts w:ascii="Times New Roman" w:hAnsi="Times New Roman" w:cs="Times New Roman"/>
-                <w:bCs/>
-              </w:rPr>
-              <w:fldChar w:fldCharType="separate"/>
-            </w:r>
-            <w:r>
-              <w:rPr>
-                <w:rFonts w:ascii="Times New Roman" w:hAnsi="Times New Roman" w:cs="Times New Roman"/>
-                <w:bCs/>
-                <w:noProof/>
-              </w:rPr>
-              <w:t>4</w:t>
-            </w:r>
-            <w:r>
-              <w:rPr>
-                <w:rFonts w:ascii="Times New Roman" w:hAnsi="Times New Roman" w:cs="Times New Roman"/>
-                <w:bCs/>
-              </w:rPr>
-              <w:fldChar w:fldCharType="end"/>
-            </w:r>
-            <w:r>
-              <w:rPr>
-                <w:rFonts w:ascii="Times New Roman" w:hAnsi="Times New Roman" w:cs="Times New Roman"/>
-              </w:rPr>
-              <w:t>/</w:t>
-            </w:r>
-            <w:r>
-              <w:rPr>
-                <w:rFonts w:ascii="Times New Roman" w:hAnsi="Times New Roman" w:cs="Times New Roman"/>
-                <w:bCs/>
-              </w:rPr>
-              <w:fldChar w:fldCharType="begin"/>
-            </w:r>
-            <w:r>
-              <w:rPr>
-                <w:rFonts w:ascii="Times New Roman" w:hAnsi="Times New Roman" w:cs="Times New Roman"/>
-                <w:bCs/>
-              </w:rPr>
-              <w:instrText xml:space="preserve"> NUMPAGES  </w:instrText>
-            </w:r>
-            <w:r>
-              <w:rPr>
-                <w:rFonts w:ascii="Times New Roman" w:hAnsi="Times New Roman" w:cs="Times New Roman"/>
-                <w:bCs/>
-              </w:rPr>
-              <w:fldChar w:fldCharType="separate"/>
-            </w:r>
-            <w:r>
-              <w:rPr>
-                <w:rFonts w:ascii="Times New Roman" w:hAnsi="Times New Roman" w:cs="Times New Roman"/>
-                <w:bCs/>
-                <w:noProof/>
-              </w:rPr>
-              <w:t>4</w:t>
-            </w:r>
-            <w:r>
-              <w:rPr>
-                <w:rFonts w:ascii="Times New Roman" w:hAnsi="Times New Roman" w:cs="Times New Roman"/>
-                <w:bCs/>
-              </w:rPr>
-              <w:fldChar w:fldCharType="end"/>
-            </w:r>
-          </w:p>
-        </w:sdtContent>
-      </w:sdt>
-    </w:sdtContent>
-  </w:sdt>
+<w:ftr xmlns:wpc="http://schemas.microsoft.com/office/word/2010/wordprocessingCanvas" xmlns:cx="http://schemas.microsoft.com/office/drawing/2014/chartex" xmlns:cx1="http://schemas.microsoft.com/office/drawing/2015/9/8/chartex" xmlns:cx2="http://schemas.microsoft.com/office/drawing/2015/10/21/chartex" xmlns:cx3="http://schemas.microsoft.com/office/drawing/2016/5/9/chartex" xmlns:cx4="http://schemas.microsoft.com/office/drawing/2016/5/10/chartex" xmlns:cx5="http://schemas.microsoft.com/office/drawing/2016/5/11/chartex" xmlns:mc="http://schemas.openxmlformats.org/markup-compatibility/2006" xmlns:o="urn:schemas-microsoft-com:office:office" xmlns:r="http://schemas.openxmlformats.org/officeDocument/2006/relationships" xmlns:m="http://schemas.openxmlformats.org/officeDocument/2006/math" xmlns:v="urn:schemas-microsoft-com:vml" xmlns:wp14="http://schemas.microsoft.com/office/word/2010/wordprocessingDrawing" xmlns:wp="http://schemas.openxmlformats.org/drawingml/2006/wordprocessingDrawing" xmlns:w10="urn:schemas-microsoft-com:office:word" xmlns:w="http://schemas.openxmlformats.org/wordprocessingml/2006/main" xmlns:w14="http://schemas.microsoft.com/office/word/2010/wordml" xmlns:w15="http://schemas.microsoft.com/office/word/2012/wordml" xmlns:w16se="http://schemas.microsoft.com/office/word/2015/wordml/symex" xmlns:wpg="http://schemas.microsoft.com/office/word/2010/wordprocessingGroup" xmlns:wpi="http://schemas.microsoft.com/office/word/2010/wordprocessingInk" xmlns:wne="http://schemas.microsoft.com/office/word/2006/wordml" xmlns:wps="http://schemas.microsoft.com/office/word/2010/wordprocessingShape" mc:Ignorable="w14 w15 w16se wp14">
+  <w:p>
+    <w:pPr>
+      <w:pStyle w:val="Footer"/>
+      <w:jc w:val="right"/>
+      <w:rPr>
+        <w:rFonts w:ascii="Times New Roman" w:hAnsi="Times New Roman" w:cs="Times New Roman"/>
+        <w:sz w:val="20"/>
+        <w:szCs w:val="20"/>
+      </w:rPr>
+    </w:pPr>
+    <w:r>
+      <w:rPr>
+        <w:rFonts w:ascii="Times New Roman" w:hAnsi="Times New Roman" w:cs="Times New Roman"/>
+        <w:sz w:val="20"/>
+        <w:szCs w:val="20"/>
+      </w:rPr>
+      <w:t xml:space="preserve">Updated </w:t>
+    </w:r>
+    <w:r>
+      <w:rPr>
+        <w:rFonts w:ascii="Times New Roman" w:hAnsi="Times New Roman" w:cs="Times New Roman"/>
+        <w:sz w:val="20"/>
+        <w:szCs w:val="20"/>
+      </w:rPr>
+      <w:fldChar w:fldCharType="begin"/>
+    </w:r>
+    <w:r>
+      <w:rPr>
+        <w:rFonts w:ascii="Times New Roman" w:hAnsi="Times New Roman" w:cs="Times New Roman"/>
+        <w:sz w:val="20"/>
+        <w:szCs w:val="20"/>
+      </w:rPr>
+      <w:instrText xml:space="preserve"> DATE \@ "d MMMM yyyy" </w:instrText>
+    </w:r>
+    <w:r>
+      <w:rPr>
+        <w:rFonts w:ascii="Times New Roman" w:hAnsi="Times New Roman" w:cs="Times New Roman"/>
+        <w:sz w:val="20"/>
+        <w:szCs w:val="20"/>
+      </w:rPr>
+      <w:fldChar w:fldCharType="separate"/>
+    </w:r>
+    <w:r>
+      <w:rPr>
+        <w:rFonts w:ascii="Times New Roman" w:hAnsi="Times New Roman" w:cs="Times New Roman"/>
+        <w:noProof/>
+        <w:sz w:val="20"/>
+        <w:szCs w:val="20"/>
+      </w:rPr>
+      <w:t>9 December 2016</w:t>
+    </w:r>
+    <w:r>
+      <w:rPr>
+        <w:rFonts w:ascii="Times New Roman" w:hAnsi="Times New Roman" w:cs="Times New Roman"/>
+        <w:sz w:val="20"/>
+        <w:szCs w:val="20"/>
+      </w:rPr>
+      <w:fldChar w:fldCharType="end"/>
+    </w:r>
+    <w:r>
+      <w:rPr>
+        <w:rFonts w:ascii="Times New Roman" w:hAnsi="Times New Roman" w:cs="Times New Roman"/>
+        <w:sz w:val="20"/>
+        <w:szCs w:val="20"/>
+      </w:rPr>
+      <w:ptab w:relativeTo="margin" w:alignment="right" w:leader="none"/>
+    </w:r>
+    <w:r>
+      <w:rPr>
+        <w:rFonts w:ascii="Times New Roman" w:hAnsi="Times New Roman" w:cs="Times New Roman"/>
+        <w:bCs/>
+        <w:noProof/>
+        <w:sz w:val="20"/>
+        <w:szCs w:val="20"/>
+      </w:rPr>
+      <w:fldChar w:fldCharType="begin"/>
+    </w:r>
+    <w:r>
+      <w:rPr>
+        <w:rFonts w:ascii="Times New Roman" w:hAnsi="Times New Roman" w:cs="Times New Roman"/>
+        <w:bCs/>
+        <w:noProof/>
+        <w:sz w:val="20"/>
+        <w:szCs w:val="20"/>
+      </w:rPr>
+      <w:instrText xml:space="preserve"> PAGE  \* Arabic  \* MERGEFORMAT </w:instrText>
+    </w:r>
+    <w:r>
+      <w:rPr>
+        <w:rFonts w:ascii="Times New Roman" w:hAnsi="Times New Roman" w:cs="Times New Roman"/>
+        <w:bCs/>
+        <w:noProof/>
+        <w:sz w:val="20"/>
+        <w:szCs w:val="20"/>
+      </w:rPr>
+      <w:fldChar w:fldCharType="separate"/>
+    </w:r>
+    <w:r>
+      <w:rPr>
+        <w:rFonts w:ascii="Times New Roman" w:hAnsi="Times New Roman" w:cs="Times New Roman"/>
+        <w:bCs/>
+        <w:noProof/>
+        <w:sz w:val="20"/>
+        <w:szCs w:val="20"/>
+      </w:rPr>
+      <w:t>2</w:t>
+    </w:r>
+    <w:r>
+      <w:rPr>
+        <w:rFonts w:ascii="Times New Roman" w:hAnsi="Times New Roman" w:cs="Times New Roman"/>
+        <w:bCs/>
+        <w:noProof/>
+        <w:sz w:val="20"/>
+        <w:szCs w:val="20"/>
+      </w:rPr>
+      <w:fldChar w:fldCharType="end"/>
+    </w:r>
+    <w:r>
+      <w:rPr>
+        <w:rFonts w:ascii="Times New Roman" w:hAnsi="Times New Roman" w:cs="Times New Roman"/>
+        <w:noProof/>
+        <w:sz w:val="20"/>
+        <w:szCs w:val="20"/>
+      </w:rPr>
+      <w:t>/</w:t>
+    </w:r>
+    <w:r>
+      <w:rPr>
+        <w:rFonts w:ascii="Times New Roman" w:hAnsi="Times New Roman" w:cs="Times New Roman"/>
+        <w:bCs/>
+        <w:noProof/>
+        <w:sz w:val="20"/>
+        <w:szCs w:val="20"/>
+      </w:rPr>
+      <w:fldChar w:fldCharType="begin"/>
+    </w:r>
+    <w:r>
+      <w:rPr>
+        <w:rFonts w:ascii="Times New Roman" w:hAnsi="Times New Roman" w:cs="Times New Roman"/>
+        <w:bCs/>
+        <w:noProof/>
+        <w:sz w:val="20"/>
+        <w:szCs w:val="20"/>
+      </w:rPr>
+      <w:instrText xml:space="preserve"> NUMPAGES  \* Arabic  \* MERGEFORMAT </w:instrText>
+    </w:r>
+    <w:r>
+      <w:rPr>
+        <w:rFonts w:ascii="Times New Roman" w:hAnsi="Times New Roman" w:cs="Times New Roman"/>
+        <w:bCs/>
+        <w:noProof/>
+        <w:sz w:val="20"/>
+        <w:szCs w:val="20"/>
+      </w:rPr>
+      <w:fldChar w:fldCharType="separate"/>
+    </w:r>
+    <w:r>
+      <w:rPr>
+        <w:rFonts w:ascii="Times New Roman" w:hAnsi="Times New Roman" w:cs="Times New Roman"/>
+        <w:bCs/>
+        <w:noProof/>
+        <w:sz w:val="20"/>
+        <w:szCs w:val="20"/>
+      </w:rPr>
+      <w:t>4</w:t>
+    </w:r>
+    <w:r>
+      <w:rPr>
+        <w:rFonts w:ascii="Times New Roman" w:hAnsi="Times New Roman" w:cs="Times New Roman"/>
+        <w:bCs/>
+        <w:noProof/>
+        <w:sz w:val="20"/>
+        <w:szCs w:val="20"/>
+      </w:rPr>
+      <w:fldChar w:fldCharType="end"/>
+    </w:r>
+  </w:p>
 </w:ftr>
 </file>
 
 <file path=word/footnotes.xml><?xml version="1.0" encoding="utf-8"?>
-<w:footnotes xmlns:wpc="http://schemas.microsoft.com/office/word/2010/wordprocessingCanvas" xmlns:cx="http://schemas.microsoft.com/office/drawing/2014/chartex" xmlns:cx1="http://schemas.microsoft.com/office/drawing/2015/9/8/chartex" xmlns:mc="http://schemas.openxmlformats.org/markup-compatibility/2006" xmlns:o="urn:schemas-microsoft-com:office:office" xmlns:r="http://schemas.openxmlformats.org/officeDocument/2006/relationships" xmlns:m="http://schemas.openxmlformats.org/officeDocument/2006/math" xmlns:v="urn:schemas-microsoft-com:vml" xmlns:wp14="http://schemas.microsoft.com/office/word/2010/wordprocessingDrawing" xmlns:wp="http://schemas.openxmlformats.org/drawingml/2006/wordprocessingDrawing" xmlns:w10="urn:schemas-microsoft-com:office:word" xmlns:w="http://schemas.openxmlformats.org/wordprocessingml/2006/main" xmlns:w14="http://schemas.microsoft.com/office/word/2010/wordml" xmlns:w15="http://schemas.microsoft.com/office/word/2012/wordml" xmlns:w16se="http://schemas.microsoft.com/office/word/2015/wordml/symex" xmlns:wpg="http://schemas.microsoft.com/office/word/2010/wordprocessingGroup" xmlns:wpi="http://schemas.microsoft.com/office/word/2010/wordprocessingInk" xmlns:wne="http://schemas.microsoft.com/office/word/2006/wordml" xmlns:wps="http://schemas.microsoft.com/office/word/2010/wordprocessingShape" mc:Ignorable="w14 w15 w16se wp14">
+<w:footnotes xmlns:wpc="http://schemas.microsoft.com/office/word/2010/wordprocessingCanvas" xmlns:cx="http://schemas.microsoft.com/office/drawing/2014/chartex" xmlns:cx1="http://schemas.microsoft.com/office/drawing/2015/9/8/chartex" xmlns:cx2="http://schemas.microsoft.com/office/drawing/2015/10/21/chartex" xmlns:cx3="http://schemas.microsoft.com/office/drawing/2016/5/9/chartex" xmlns:cx4="http://schemas.microsoft.com/office/drawing/2016/5/10/chartex" xmlns:cx5="http://schemas.microsoft.com/office/drawing/2016/5/11/chartex" xmlns:mc="http://schemas.openxmlformats.org/markup-compatibility/2006" xmlns:o="urn:schemas-microsoft-com:office:office" xmlns:r="http://schemas.openxmlformats.org/officeDocument/2006/relationships" xmlns:m="http://schemas.openxmlformats.org/officeDocument/2006/math" xmlns:v="urn:schemas-microsoft-com:vml" xmlns:wp14="http://schemas.microsoft.com/office/word/2010/wordprocessingDrawing" xmlns:wp="http://schemas.openxmlformats.org/drawingml/2006/wordprocessingDrawing" xmlns:w10="urn:schemas-microsoft-com:office:word" xmlns:w="http://schemas.openxmlformats.org/wordprocessingml/2006/main" xmlns:w14="http://schemas.microsoft.com/office/word/2010/wordml" xmlns:w15="http://schemas.microsoft.com/office/word/2012/wordml" xmlns:w16se="http://schemas.microsoft.com/office/word/2015/wordml/symex" xmlns:wpg="http://schemas.microsoft.com/office/word/2010/wordprocessingGroup" xmlns:wpi="http://schemas.microsoft.com/office/word/2010/wordprocessingInk" xmlns:wne="http://schemas.microsoft.com/office/word/2006/wordml" xmlns:wps="http://schemas.microsoft.com/office/word/2010/wordprocessingShape" mc:Ignorable="w14 w15 w16se wp14">
   <w:footnote w:type="separator" w:id="-1">
     <w:p>
       <w:pPr>
@@ -3389,7 +3445,7 @@
 </file>
 
 <file path=word/numbering.xml><?xml version="1.0" encoding="utf-8"?>
-<w:numbering xmlns:wpc="http://schemas.microsoft.com/office/word/2010/wordprocessingCanvas" xmlns:cx="http://schemas.microsoft.com/office/drawing/2014/chartex" xmlns:cx1="http://schemas.microsoft.com/office/drawing/2015/9/8/chartex" xmlns:mc="http://schemas.openxmlformats.org/markup-compatibility/2006" xmlns:o="urn:schemas-microsoft-com:office:office" xmlns:r="http://schemas.openxmlformats.org/officeDocument/2006/relationships" xmlns:m="http://schemas.openxmlformats.org/officeDocument/2006/math" xmlns:v="urn:schemas-microsoft-com:vml" xmlns:wp14="http://schemas.microsoft.com/office/word/2010/wordprocessingDrawing" xmlns:wp="http://schemas.openxmlformats.org/drawingml/2006/wordprocessingDrawing" xmlns:w10="urn:schemas-microsoft-com:office:word" xmlns:w="http://schemas.openxmlformats.org/wordprocessingml/2006/main" xmlns:w14="http://schemas.microsoft.com/office/word/2010/wordml" xmlns:w15="http://schemas.microsoft.com/office/word/2012/wordml" xmlns:w16se="http://schemas.microsoft.com/office/word/2015/wordml/symex" xmlns:wpg="http://schemas.microsoft.com/office/word/2010/wordprocessingGroup" xmlns:wpi="http://schemas.microsoft.com/office/word/2010/wordprocessingInk" xmlns:wne="http://schemas.microsoft.com/office/word/2006/wordml" xmlns:wps="http://schemas.microsoft.com/office/word/2010/wordprocessingShape" mc:Ignorable="w14 w15 w16se wp14">
+<w:numbering xmlns:wpc="http://schemas.microsoft.com/office/word/2010/wordprocessingCanvas" xmlns:cx="http://schemas.microsoft.com/office/drawing/2014/chartex" xmlns:cx1="http://schemas.microsoft.com/office/drawing/2015/9/8/chartex" xmlns:cx2="http://schemas.microsoft.com/office/drawing/2015/10/21/chartex" xmlns:cx3="http://schemas.microsoft.com/office/drawing/2016/5/9/chartex" xmlns:cx4="http://schemas.microsoft.com/office/drawing/2016/5/10/chartex" xmlns:cx5="http://schemas.microsoft.com/office/drawing/2016/5/11/chartex" xmlns:mc="http://schemas.openxmlformats.org/markup-compatibility/2006" xmlns:o="urn:schemas-microsoft-com:office:office" xmlns:r="http://schemas.openxmlformats.org/officeDocument/2006/relationships" xmlns:m="http://schemas.openxmlformats.org/officeDocument/2006/math" xmlns:v="urn:schemas-microsoft-com:vml" xmlns:wp14="http://schemas.microsoft.com/office/word/2010/wordprocessingDrawing" xmlns:wp="http://schemas.openxmlformats.org/drawingml/2006/wordprocessingDrawing" xmlns:w10="urn:schemas-microsoft-com:office:word" xmlns:w="http://schemas.openxmlformats.org/wordprocessingml/2006/main" xmlns:w14="http://schemas.microsoft.com/office/word/2010/wordml" xmlns:w15="http://schemas.microsoft.com/office/word/2012/wordml" xmlns:w16se="http://schemas.microsoft.com/office/word/2015/wordml/symex" xmlns:wpg="http://schemas.microsoft.com/office/word/2010/wordprocessingGroup" xmlns:wpi="http://schemas.microsoft.com/office/word/2010/wordprocessingInk" xmlns:wne="http://schemas.microsoft.com/office/word/2006/wordml" xmlns:wps="http://schemas.microsoft.com/office/word/2010/wordprocessingShape" mc:Ignorable="w14 w15 w16se wp14">
   <w:abstractNum w:abstractNumId="0" w15:restartNumberingAfterBreak="0">
     <w:nsid w:val="289F0408"/>
     <w:multiLevelType w:val="hybridMultilevel"/>
@@ -3847,7 +3903,7 @@
       </w:pPr>
     </w:pPrDefault>
   </w:docDefaults>
-  <w:latentStyles w:defLockedState="0" w:defUIPriority="99" w:defSemiHidden="0" w:defUnhideWhenUsed="0" w:defQFormat="0" w:count="371">
+  <w:latentStyles w:defLockedState="0" w:defUIPriority="99" w:defSemiHidden="0" w:defUnhideWhenUsed="0" w:defQFormat="0" w:count="374">
     <w:lsdException w:name="Normal" w:uiPriority="0" w:qFormat="1"/>
     <w:lsdException w:name="heading 1" w:uiPriority="9" w:qFormat="1"/>
     <w:lsdException w:name="heading 2" w:semiHidden="1" w:uiPriority="9" w:unhideWhenUsed="1" w:qFormat="1"/>
@@ -3953,7 +4009,6 @@
     <w:lsdException w:name="HTML Sample" w:semiHidden="1" w:unhideWhenUsed="1"/>
     <w:lsdException w:name="HTML Typewriter" w:semiHidden="1" w:unhideWhenUsed="1"/>
     <w:lsdException w:name="HTML Variable" w:semiHidden="1" w:unhideWhenUsed="1"/>
-    <w:lsdException w:name="Normal Table" w:semiHidden="1" w:unhideWhenUsed="1"/>
     <w:lsdException w:name="annotation subject" w:semiHidden="1" w:unhideWhenUsed="1"/>
     <w:lsdException w:name="No List" w:semiHidden="1" w:unhideWhenUsed="1"/>
     <w:lsdException w:name="Outline List 1" w:semiHidden="1" w:unhideWhenUsed="1"/>
@@ -3998,7 +4053,6 @@
     <w:lsdException w:name="Table Professional" w:semiHidden="1" w:unhideWhenUsed="1"/>
     <w:lsdException w:name="Table Subtle 1" w:semiHidden="1" w:unhideWhenUsed="1"/>
     <w:lsdException w:name="Table Subtle 2" w:semiHidden="1" w:unhideWhenUsed="1"/>
-    <w:lsdException w:name="Table Web 1" w:semiHidden="1" w:unhideWhenUsed="1"/>
     <w:lsdException w:name="Table Web 2" w:semiHidden="1" w:unhideWhenUsed="1"/>
     <w:lsdException w:name="Table Web 3" w:semiHidden="1" w:unhideWhenUsed="1"/>
     <w:lsdException w:name="Balloon Text" w:semiHidden="1" w:unhideWhenUsed="1"/>
@@ -4219,6 +4273,9 @@
     <w:lsdException w:name="List Table 5 Dark Accent 6" w:uiPriority="50"/>
     <w:lsdException w:name="List Table 6 Colorful Accent 6" w:uiPriority="51"/>
     <w:lsdException w:name="List Table 7 Colorful Accent 6" w:uiPriority="52"/>
+    <w:lsdException w:name="Mention" w:semiHidden="1" w:unhideWhenUsed="1"/>
+    <w:lsdException w:name="Smart Hyperlink" w:semiHidden="1" w:unhideWhenUsed="1"/>
+    <w:lsdException w:name="Hashtag" w:semiHidden="1" w:unhideWhenUsed="1"/>
   </w:latentStyles>
   <w:style w:type="paragraph" w:default="1" w:styleId="Normal">
     <w:name w:val="Normal"/>
@@ -4610,7 +4667,7 @@
 </file>
 
 <file path=customXml/itemProps1.xml><?xml version="1.0" encoding="utf-8"?>
-<ds:datastoreItem xmlns:ds="http://schemas.openxmlformats.org/officeDocument/2006/customXml" ds:itemID="{BC371DBB-AA0F-4270-A4BE-97F83184159C}">
+<ds:datastoreItem xmlns:ds="http://schemas.openxmlformats.org/officeDocument/2006/customXml" ds:itemID="{EB1D3B4A-B70A-44CA-A69E-9287111BA56B}">
   <ds:schemaRefs>
     <ds:schemaRef ds:uri="http://schemas.openxmlformats.org/officeDocument/2006/bibliography"/>
   </ds:schemaRefs>

</xml_diff>

<commit_message>
removed references from cv
</commit_message>
<xml_diff>
--- a/files/cv.docx
+++ b/files/cv.docx
@@ -49,7 +49,7 @@
         <w:tblInd w:w="0" w:type="dxa"/>
         <w:tblCellMar>
           <w:top w:w="0" w:type="dxa"/>
-          <w:left w:w="118" w:type="dxa"/>
+          <w:left w:w="123" w:type="dxa"/>
           <w:bottom w:w="0" w:type="dxa"/>
           <w:right w:w="108" w:type="dxa"/>
         </w:tblCellMar>
@@ -1421,7 +1421,7 @@
         <w:tblInd w:w="0" w:type="dxa"/>
         <w:tblCellMar>
           <w:top w:w="0" w:type="dxa"/>
-          <w:left w:w="118" w:type="dxa"/>
+          <w:left w:w="123" w:type="dxa"/>
           <w:bottom w:w="0" w:type="dxa"/>
           <w:right w:w="108" w:type="dxa"/>
         </w:tblCellMar>
@@ -1665,7 +1665,7 @@
         <w:tblInd w:w="0" w:type="dxa"/>
         <w:tblCellMar>
           <w:top w:w="0" w:type="dxa"/>
-          <w:left w:w="118" w:type="dxa"/>
+          <w:left w:w="123" w:type="dxa"/>
           <w:bottom w:w="0" w:type="dxa"/>
           <w:right w:w="108" w:type="dxa"/>
         </w:tblCellMar>
@@ -2298,353 +2298,13 @@
           <w:numId w:val="1"/>
         </w:numPr>
         <w:spacing w:before="0" w:after="160"/>
-        <w:rPr>
-          <w:rFonts w:ascii="Times New Roman" w:hAnsi="Times New Roman" w:cs="Times New Roman"/>
-        </w:rPr>
+        <w:rPr/>
       </w:pPr>
       <w:r>
         <w:rPr>
           <w:rFonts w:cs="Times New Roman" w:ascii="Times New Roman" w:hAnsi="Times New Roman"/>
         </w:rPr>
         <w:t>Mensa International.</w:t>
-      </w:r>
-    </w:p>
-    <w:p>
-      <w:pPr>
-        <w:pStyle w:val="Normal"/>
-        <w:rPr>
-          <w:rFonts w:ascii="Times New Roman" w:hAnsi="Times New Roman" w:cs="Times New Roman"/>
-          <w:b/>
-          <w:b/>
-          <w:sz w:val="28"/>
-        </w:rPr>
-      </w:pPr>
-      <w:r>
-        <w:rPr>
-          <w:rFonts w:cs="Times New Roman" w:ascii="Times New Roman" w:hAnsi="Times New Roman"/>
-          <w:b/>
-          <w:sz w:val="28"/>
-        </w:rPr>
-        <w:t>References</w:t>
-      </w:r>
-    </w:p>
-    <w:tbl>
-      <w:tblPr>
-        <w:tblStyle w:val="TableGrid"/>
-        <w:tblW w:w="9072" w:type="dxa"/>
-        <w:jc w:val="center"/>
-        <w:tblInd w:w="0" w:type="dxa"/>
-        <w:tblCellMar>
-          <w:top w:w="0" w:type="dxa"/>
-          <w:left w:w="118" w:type="dxa"/>
-          <w:bottom w:w="0" w:type="dxa"/>
-          <w:right w:w="108" w:type="dxa"/>
-        </w:tblCellMar>
-        <w:tblLook w:val="04a0" w:noVBand="1" w:noHBand="0" w:lastColumn="0" w:firstColumn="1" w:lastRow="0" w:firstRow="1"/>
-      </w:tblPr>
-      <w:tblGrid>
-        <w:gridCol w:w="3024"/>
-        <w:gridCol w:w="3024"/>
-        <w:gridCol w:w="3024"/>
-      </w:tblGrid>
-      <w:tr>
-        <w:trPr/>
-        <w:tc>
-          <w:tcPr>
-            <w:tcW w:w="3024" w:type="dxa"/>
-            <w:tcBorders>
-              <w:top w:val="nil"/>
-              <w:left w:val="nil"/>
-              <w:bottom w:val="nil"/>
-              <w:right w:val="nil"/>
-              <w:insideH w:val="nil"/>
-              <w:insideV w:val="nil"/>
-            </w:tcBorders>
-            <w:shd w:fill="auto" w:val="clear"/>
-          </w:tcPr>
-          <w:p>
-            <w:pPr>
-              <w:pStyle w:val="Normal"/>
-              <w:spacing w:lineRule="auto" w:line="240" w:before="0" w:after="80"/>
-              <w:jc w:val="center"/>
-              <w:rPr>
-                <w:rFonts w:ascii="Times New Roman" w:hAnsi="Times New Roman" w:cs="Times New Roman"/>
-                <w:b/>
-                <w:b/>
-              </w:rPr>
-            </w:pPr>
-            <w:r>
-              <w:rPr>
-                <w:rFonts w:cs="Times New Roman" w:ascii="Times New Roman" w:hAnsi="Times New Roman"/>
-                <w:b/>
-              </w:rPr>
-              <w:t>Dr. Kristy Boyer</w:t>
-            </w:r>
-          </w:p>
-          <w:p>
-            <w:pPr>
-              <w:pStyle w:val="Normal"/>
-              <w:spacing w:lineRule="auto" w:line="240" w:before="0" w:after="80"/>
-              <w:jc w:val="center"/>
-              <w:rPr>
-                <w:rFonts w:ascii="Times New Roman" w:hAnsi="Times New Roman" w:cs="Times New Roman"/>
-                <w:b/>
-                <w:b/>
-              </w:rPr>
-            </w:pPr>
-            <w:r>
-              <w:rPr>
-                <w:rFonts w:cs="Times New Roman" w:ascii="Times New Roman" w:hAnsi="Times New Roman"/>
-                <w:sz w:val="20"/>
-              </w:rPr>
-              <w:t>Associate Professor</w:t>
-            </w:r>
-          </w:p>
-          <w:p>
-            <w:pPr>
-              <w:pStyle w:val="Normal"/>
-              <w:spacing w:lineRule="auto" w:line="240" w:before="0" w:after="80"/>
-              <w:jc w:val="center"/>
-              <w:rPr>
-                <w:rFonts w:ascii="Times New Roman" w:hAnsi="Times New Roman" w:cs="Times New Roman"/>
-                <w:sz w:val="20"/>
-              </w:rPr>
-            </w:pPr>
-            <w:r>
-              <w:rPr>
-                <w:rFonts w:cs="Times New Roman" w:ascii="Times New Roman" w:hAnsi="Times New Roman"/>
-                <w:sz w:val="20"/>
-              </w:rPr>
-              <w:t>Department of Computer and Information Science and Engineering</w:t>
-              <w:br/>
-              <w:t>University of Florida</w:t>
-            </w:r>
-          </w:p>
-          <w:p>
-            <w:pPr>
-              <w:pStyle w:val="Normal"/>
-              <w:spacing w:lineRule="auto" w:line="240" w:before="0" w:after="0"/>
-              <w:jc w:val="center"/>
-              <w:rPr>
-                <w:rFonts w:ascii="Times New Roman" w:hAnsi="Times New Roman" w:cs="Times New Roman"/>
-              </w:rPr>
-            </w:pPr>
-            <w:r>
-              <w:rPr>
-                <w:rFonts w:cs="Times New Roman" w:ascii="Times New Roman" w:hAnsi="Times New Roman"/>
-                <w:sz w:val="20"/>
-              </w:rPr>
-              <w:t>352.505.1902</w:t>
-              <w:br/>
-              <w:t>keboyer@ufl.edu</w:t>
-            </w:r>
-          </w:p>
-        </w:tc>
-        <w:tc>
-          <w:tcPr>
-            <w:tcW w:w="3024" w:type="dxa"/>
-            <w:tcBorders>
-              <w:top w:val="nil"/>
-              <w:left w:val="nil"/>
-              <w:bottom w:val="nil"/>
-              <w:right w:val="nil"/>
-              <w:insideH w:val="nil"/>
-              <w:insideV w:val="nil"/>
-            </w:tcBorders>
-            <w:shd w:fill="auto" w:val="clear"/>
-          </w:tcPr>
-          <w:p>
-            <w:pPr>
-              <w:pStyle w:val="Normal"/>
-              <w:spacing w:lineRule="auto" w:line="276" w:before="0" w:after="80"/>
-              <w:jc w:val="center"/>
-              <w:rPr>
-                <w:rFonts w:ascii="Times New Roman" w:hAnsi="Times New Roman" w:cs="Times New Roman"/>
-                <w:b/>
-                <w:b/>
-              </w:rPr>
-            </w:pPr>
-            <w:r>
-              <w:rPr>
-                <w:rFonts w:cs="Times New Roman" w:ascii="Times New Roman" w:hAnsi="Times New Roman"/>
-                <w:b/>
-              </w:rPr>
-              <w:t>Dr. James Lester</w:t>
-            </w:r>
-          </w:p>
-          <w:p>
-            <w:pPr>
-              <w:pStyle w:val="Normal"/>
-              <w:spacing w:before="0" w:after="80"/>
-              <w:jc w:val="center"/>
-              <w:rPr>
-                <w:rFonts w:ascii="Times New Roman" w:hAnsi="Times New Roman" w:cs="Times New Roman"/>
-                <w:sz w:val="20"/>
-              </w:rPr>
-            </w:pPr>
-            <w:r>
-              <w:rPr>
-                <w:rFonts w:cs="Times New Roman" w:ascii="Times New Roman" w:hAnsi="Times New Roman"/>
-                <w:sz w:val="20"/>
-              </w:rPr>
-              <w:t>Distinguished Professor &amp; Director of the Center for Educational Informatics</w:t>
-            </w:r>
-          </w:p>
-          <w:p>
-            <w:pPr>
-              <w:pStyle w:val="Normal"/>
-              <w:spacing w:before="0" w:after="80"/>
-              <w:jc w:val="center"/>
-              <w:rPr>
-                <w:rFonts w:ascii="Times New Roman" w:hAnsi="Times New Roman" w:cs="Times New Roman"/>
-                <w:sz w:val="20"/>
-              </w:rPr>
-            </w:pPr>
-            <w:r>
-              <w:rPr>
-                <w:rFonts w:cs="Times New Roman" w:ascii="Times New Roman" w:hAnsi="Times New Roman"/>
-                <w:sz w:val="20"/>
-              </w:rPr>
-              <w:t>Department of Computer Science</w:t>
-              <w:br/>
-              <w:t>North Carolina State University</w:t>
-            </w:r>
-          </w:p>
-          <w:p>
-            <w:pPr>
-              <w:pStyle w:val="Normal"/>
-              <w:spacing w:before="0" w:after="0"/>
-              <w:jc w:val="center"/>
-              <w:rPr>
-                <w:rFonts w:ascii="Times New Roman" w:hAnsi="Times New Roman" w:cs="Times New Roman"/>
-              </w:rPr>
-            </w:pPr>
-            <w:r>
-              <w:rPr>
-                <w:rFonts w:cs="Times New Roman" w:ascii="Times New Roman" w:hAnsi="Times New Roman"/>
-                <w:sz w:val="20"/>
-              </w:rPr>
-              <w:t>919.515.7534</w:t>
-              <w:br/>
-              <w:t>lester@ncsu.edu</w:t>
-            </w:r>
-          </w:p>
-        </w:tc>
-        <w:tc>
-          <w:tcPr>
-            <w:tcW w:w="3024" w:type="dxa"/>
-            <w:tcBorders>
-              <w:top w:val="nil"/>
-              <w:left w:val="nil"/>
-              <w:bottom w:val="nil"/>
-              <w:right w:val="nil"/>
-              <w:insideH w:val="nil"/>
-              <w:insideV w:val="nil"/>
-            </w:tcBorders>
-            <w:shd w:fill="auto" w:val="clear"/>
-          </w:tcPr>
-          <w:p>
-            <w:pPr>
-              <w:pStyle w:val="Normal"/>
-              <w:spacing w:lineRule="auto" w:line="240" w:before="0" w:after="80"/>
-              <w:jc w:val="center"/>
-              <w:rPr>
-                <w:rFonts w:ascii="Times New Roman" w:hAnsi="Times New Roman" w:cs="Times New Roman"/>
-              </w:rPr>
-            </w:pPr>
-            <w:r>
-              <w:rPr>
-                <w:rFonts w:cs="Times New Roman" w:ascii="Times New Roman" w:hAnsi="Times New Roman"/>
-                <w:b/>
-              </w:rPr>
-              <w:t>Dr. Tiffany Barnes</w:t>
-            </w:r>
-          </w:p>
-          <w:p>
-            <w:pPr>
-              <w:pStyle w:val="Normal"/>
-              <w:spacing w:lineRule="auto" w:line="240" w:before="0" w:after="80"/>
-              <w:jc w:val="center"/>
-              <w:rPr>
-                <w:rFonts w:ascii="Times New Roman" w:hAnsi="Times New Roman" w:cs="Times New Roman"/>
-                <w:sz w:val="20"/>
-              </w:rPr>
-            </w:pPr>
-            <w:r>
-              <w:rPr>
-                <w:rFonts w:cs="Times New Roman" w:ascii="Times New Roman" w:hAnsi="Times New Roman"/>
-                <w:sz w:val="20"/>
-              </w:rPr>
-              <w:t>Associate Professor</w:t>
-            </w:r>
-          </w:p>
-          <w:p>
-            <w:pPr>
-              <w:pStyle w:val="Normal"/>
-              <w:spacing w:lineRule="auto" w:line="240" w:before="0" w:after="80"/>
-              <w:jc w:val="center"/>
-              <w:rPr>
-                <w:rFonts w:ascii="Times New Roman" w:hAnsi="Times New Roman" w:cs="Times New Roman"/>
-                <w:sz w:val="20"/>
-              </w:rPr>
-            </w:pPr>
-            <w:r>
-              <w:rPr>
-                <w:rFonts w:cs="Times New Roman" w:ascii="Times New Roman" w:hAnsi="Times New Roman"/>
-                <w:sz w:val="20"/>
-              </w:rPr>
-              <w:t>Department of Computer Science</w:t>
-              <w:br/>
-              <w:t>North Carolina State University</w:t>
-            </w:r>
-          </w:p>
-          <w:p>
-            <w:pPr>
-              <w:pStyle w:val="Normal"/>
-              <w:spacing w:lineRule="auto" w:line="240" w:before="0" w:after="0"/>
-              <w:jc w:val="center"/>
-              <w:rPr>
-                <w:rFonts w:ascii="Times New Roman" w:hAnsi="Times New Roman" w:cs="Times New Roman"/>
-                <w:sz w:val="20"/>
-              </w:rPr>
-            </w:pPr>
-            <w:r>
-              <w:rPr>
-                <w:rFonts w:cs="Times New Roman" w:ascii="Times New Roman" w:hAnsi="Times New Roman"/>
-                <w:sz w:val="20"/>
-              </w:rPr>
-              <w:t>919.515.5764</w:t>
-            </w:r>
-          </w:p>
-          <w:p>
-            <w:pPr>
-              <w:pStyle w:val="Normal"/>
-              <w:spacing w:lineRule="auto" w:line="240" w:before="0" w:after="0"/>
-              <w:jc w:val="center"/>
-              <w:rPr>
-                <w:rFonts w:ascii="Times New Roman" w:hAnsi="Times New Roman" w:cs="Times New Roman"/>
-                <w:sz w:val="20"/>
-              </w:rPr>
-            </w:pPr>
-            <w:r>
-              <w:rPr>
-                <w:rFonts w:cs="Times New Roman" w:ascii="Times New Roman" w:hAnsi="Times New Roman"/>
-                <w:sz w:val="20"/>
-              </w:rPr>
-              <w:t>tmbarnes@ncsu.edu</w:t>
-            </w:r>
-          </w:p>
-        </w:tc>
-      </w:tr>
-    </w:tbl>
-    <w:p>
-      <w:pPr>
-        <w:pStyle w:val="Normal"/>
-        <w:spacing w:before="0" w:after="160"/>
-        <w:rPr/>
-      </w:pPr>
-      <w:r>
-        <w:rPr/>
       </w:r>
     </w:p>
     <w:sectPr>
@@ -2692,7 +2352,7 @@
       <w:fldChar w:fldCharType="separate"/>
     </w:r>
     <w:r>
-      <w:t>26 March 2017</w:t>
+      <w:t>9 April 2017</w:t>
     </w:r>
     <w:r>
       <w:fldChar w:fldCharType="end"/>
@@ -2721,7 +2381,7 @@
       <w:fldChar w:fldCharType="separate"/>
     </w:r>
     <w:r>
-      <w:t>4</w:t>
+      <w:t>1</w:t>
     </w:r>
     <w:r>
       <w:fldChar w:fldCharType="end"/>
@@ -3954,6 +3614,132 @@
       <w:rFonts w:cs="Wingdings"/>
     </w:rPr>
   </w:style>
+  <w:style w:type="character" w:styleId="ListLabel46">
+    <w:name w:val="ListLabel 46"/>
+    <w:qFormat/>
+    <w:rPr>
+      <w:rFonts w:ascii="Times New Roman" w:hAnsi="Times New Roman" w:cs="Symbol"/>
+    </w:rPr>
+  </w:style>
+  <w:style w:type="character" w:styleId="ListLabel47">
+    <w:name w:val="ListLabel 47"/>
+    <w:qFormat/>
+    <w:rPr>
+      <w:rFonts w:cs="Courier New"/>
+    </w:rPr>
+  </w:style>
+  <w:style w:type="character" w:styleId="ListLabel48">
+    <w:name w:val="ListLabel 48"/>
+    <w:qFormat/>
+    <w:rPr>
+      <w:rFonts w:cs="Wingdings"/>
+    </w:rPr>
+  </w:style>
+  <w:style w:type="character" w:styleId="ListLabel49">
+    <w:name w:val="ListLabel 49"/>
+    <w:qFormat/>
+    <w:rPr>
+      <w:rFonts w:cs="Symbol"/>
+    </w:rPr>
+  </w:style>
+  <w:style w:type="character" w:styleId="ListLabel50">
+    <w:name w:val="ListLabel 50"/>
+    <w:qFormat/>
+    <w:rPr>
+      <w:rFonts w:cs="Courier New"/>
+    </w:rPr>
+  </w:style>
+  <w:style w:type="character" w:styleId="ListLabel51">
+    <w:name w:val="ListLabel 51"/>
+    <w:qFormat/>
+    <w:rPr>
+      <w:rFonts w:cs="Wingdings"/>
+    </w:rPr>
+  </w:style>
+  <w:style w:type="character" w:styleId="ListLabel52">
+    <w:name w:val="ListLabel 52"/>
+    <w:qFormat/>
+    <w:rPr>
+      <w:rFonts w:cs="Symbol"/>
+    </w:rPr>
+  </w:style>
+  <w:style w:type="character" w:styleId="ListLabel53">
+    <w:name w:val="ListLabel 53"/>
+    <w:qFormat/>
+    <w:rPr>
+      <w:rFonts w:cs="Courier New"/>
+    </w:rPr>
+  </w:style>
+  <w:style w:type="character" w:styleId="ListLabel54">
+    <w:name w:val="ListLabel 54"/>
+    <w:qFormat/>
+    <w:rPr>
+      <w:rFonts w:cs="Wingdings"/>
+    </w:rPr>
+  </w:style>
+  <w:style w:type="character" w:styleId="ListLabel55">
+    <w:name w:val="ListLabel 55"/>
+    <w:qFormat/>
+    <w:rPr>
+      <w:rFonts w:ascii="Times New Roman" w:hAnsi="Times New Roman" w:cs="Symbol"/>
+    </w:rPr>
+  </w:style>
+  <w:style w:type="character" w:styleId="ListLabel56">
+    <w:name w:val="ListLabel 56"/>
+    <w:qFormat/>
+    <w:rPr>
+      <w:rFonts w:cs="Courier New"/>
+    </w:rPr>
+  </w:style>
+  <w:style w:type="character" w:styleId="ListLabel57">
+    <w:name w:val="ListLabel 57"/>
+    <w:qFormat/>
+    <w:rPr>
+      <w:rFonts w:cs="Wingdings"/>
+    </w:rPr>
+  </w:style>
+  <w:style w:type="character" w:styleId="ListLabel58">
+    <w:name w:val="ListLabel 58"/>
+    <w:qFormat/>
+    <w:rPr>
+      <w:rFonts w:cs="Symbol"/>
+    </w:rPr>
+  </w:style>
+  <w:style w:type="character" w:styleId="ListLabel59">
+    <w:name w:val="ListLabel 59"/>
+    <w:qFormat/>
+    <w:rPr>
+      <w:rFonts w:cs="Courier New"/>
+    </w:rPr>
+  </w:style>
+  <w:style w:type="character" w:styleId="ListLabel60">
+    <w:name w:val="ListLabel 60"/>
+    <w:qFormat/>
+    <w:rPr>
+      <w:rFonts w:cs="Wingdings"/>
+    </w:rPr>
+  </w:style>
+  <w:style w:type="character" w:styleId="ListLabel61">
+    <w:name w:val="ListLabel 61"/>
+    <w:qFormat/>
+    <w:rPr>
+      <w:rFonts w:cs="Symbol"/>
+    </w:rPr>
+  </w:style>
+  <w:style w:type="character" w:styleId="ListLabel62">
+    <w:name w:val="ListLabel 62"/>
+    <w:qFormat/>
+    <w:rPr>
+      <w:rFonts w:cs="Courier New"/>
+    </w:rPr>
+  </w:style>
+  <w:style w:type="character" w:styleId="ListLabel63">
+    <w:name w:val="ListLabel 63"/>
+    <w:qFormat/>
+    <w:rPr>
+      <w:rFonts w:cs="Wingdings"/>
+    </w:rPr>
+  </w:style>
   <w:style w:type="paragraph" w:styleId="Heading">
     <w:name w:val="Heading"/>
     <w:basedOn w:val="Normal"/>

</xml_diff>